<commit_message>
Adiciona análise de precificação da Sessão Estratégica por persona
Avalia se R$700/2h está alinhado ao mercado para executivos, síndicos e
fornecedores, com ressalva de que é raciocínio de mercado geral (sem
benchmark direto de concorrentes) e recomendação de monitorar conversão
por persona antes de decidir sobre preço diferenciado.

Co-Authored-By: Claude Sonnet 5 <noreply@anthropic.com>
Claude-Session: https://claude.ai/code/session_01GQSqEjEuqv44iBdACeUWUZ
</commit_message>
<xml_diff>
--- a/eleva/analise-paginas-sessao-estrategica-diagnostico.docx
+++ b/eleva/analise-paginas-sessao-estrategica-diagnostico.docx
@@ -977,6 +977,153 @@
     </w:p>
     <w:p>
       <w:pPr>
+        <w:spacing w:after="160"/>
+      </w:pPr>
+      <w:r>
+        <w:rPr>
+          <w:sz w:val="21"/>
+          <w:szCs w:val="21"/>
+        </w:rPr>
+        <w:t xml:space="preserve">### 2.5 R$700 por 2h está alinhado ao valor de mercado?</w:t>
+      </w:r>
+    </w:p>
+    <w:p>
+      <w:pPr>
+        <w:spacing w:after="160"/>
+      </w:pPr>
+      <w:r>
+        <w:rPr>
+          <w:b/>
+          <w:bCs/>
+          <w:sz w:val="21"/>
+          <w:szCs w:val="21"/>
+        </w:rPr>
+        <w:t xml:space="preserve">Ressalva importante:</w:t>
+      </w:r>
+      <w:r>
+        <w:rPr>
+          <w:sz w:val="21"/>
+          <w:szCs w:val="21"/>
+        </w:rPr>
+        <w:t xml:space="preserve"> esta análise é baseada em raciocínio de mercado geral sobre consultoria B2B no Brasil, não em pesquisa de concorrentes em tempo real (não há acesso à internet neste ambiente para benchmark direto). Deve ser tratada como hipótese a validar, não como dado de mercado confirmado.</w:t>
+      </w:r>
+    </w:p>
+    <w:p>
+      <w:pPr>
+        <w:spacing w:after="80"/>
+      </w:pPr>
+      <w:r>
+        <w:rPr>
+          <w:i/>
+          <w:iCs/>
+          <w:color w:val="555555"/>
+          <w:sz w:val="18"/>
+          <w:szCs w:val="18"/>
+        </w:rPr>
+        <w:t xml:space="preserve">Por persona:</w:t>
+      </w:r>
+    </w:p>
+    <w:p>
+      <w:pPr>
+        <w:pStyle w:val="ListParagraph"/>
+        <w:numPr>
+          <w:ilvl w:val="0"/>
+          <w:numId w:val="1"/>
+        </w:numPr>
+        <w:spacing w:after="80"/>
+      </w:pPr>
+      <w:r>
+        <w:rPr>
+          <w:b/>
+          <w:bCs/>
+          <w:sz w:val="21"/>
+          <w:szCs w:val="21"/>
+        </w:rPr>
+        <w:t xml:space="preserve">Executivos (donos de administradora/imobiliária):</w:t>
+      </w:r>
+      <w:r>
+        <w:rPr>
+          <w:sz w:val="21"/>
+          <w:szCs w:val="21"/>
+        </w:rPr>
+        <w:t xml:space="preserve"> R$700 por 2h com um profissional com 35 anos de mercado e mais de 20 operações de M&amp;A está dentro, ou até abaixo, do que consultoria estratégica sênior costuma cobrar no Brasil (consultores seniores e especialistas em M&amp;A frequentemente cobram na faixa de R$300 a R$800+ por hora). Para esse público, que já lida com decisões de investimento maiores no negócio, o valor tende a ser bem recebido, e talvez até esteja subprecificado frente ao mercado.</w:t>
+      </w:r>
+    </w:p>
+    <w:p>
+      <w:pPr>
+        <w:pStyle w:val="ListParagraph"/>
+        <w:numPr>
+          <w:ilvl w:val="0"/>
+          <w:numId w:val="1"/>
+        </w:numPr>
+        <w:spacing w:after="80"/>
+      </w:pPr>
+      <w:r>
+        <w:rPr>
+          <w:b/>
+          <w:bCs/>
+          <w:sz w:val="21"/>
+          <w:szCs w:val="21"/>
+        </w:rPr>
+        <w:t xml:space="preserve">Síndicos profissionais:</w:t>
+      </w:r>
+      <w:r>
+        <w:rPr>
+          <w:sz w:val="21"/>
+          <w:szCs w:val="21"/>
+        </w:rPr>
+        <w:t xml:space="preserve"> público mais sensível a preço. A renda de um síndico profissional varia muito com o tamanho da carteira: quem já administra muitos condomínios tende a ver R$700 como investimento pequeno frente ao retorno possível; quem está começando (1 a 3 condomínios) pode achar alto para uma decisão isolada, principalmente já existindo o curso de R$297 como porta de entrada mais barata. O risco é filtrar só os síndicos já mais consolidados — o que não é necessariamente um problema (é público mais qualificado), mas reduz o volume de quem chega à sessão.</w:t>
+      </w:r>
+    </w:p>
+    <w:p>
+      <w:pPr>
+        <w:pStyle w:val="ListParagraph"/>
+        <w:numPr>
+          <w:ilvl w:val="0"/>
+          <w:numId w:val="1"/>
+        </w:numPr>
+        <w:spacing w:after="80"/>
+      </w:pPr>
+      <w:r>
+        <w:rPr>
+          <w:b/>
+          <w:bCs/>
+          <w:sz w:val="21"/>
+          <w:szCs w:val="21"/>
+        </w:rPr>
+        <w:t xml:space="preserve">Fornecedores e prestadores de serviço:</w:t>
+      </w:r>
+      <w:r>
+        <w:rPr>
+          <w:sz w:val="21"/>
+          <w:szCs w:val="21"/>
+        </w:rPr>
+        <w:t xml:space="preserve"> público heterogêneo, de operação pequena/local a empresa regional maior. Um fornecedor pequeno pode hesitar em pagar R$700 sem prova de retorno anterior; um fornecedor já vendendo em escala B2B tende a ver isso como custo baixo frente ao ticket de um contrato que pode fechar depois.</w:t>
+      </w:r>
+    </w:p>
+    <w:p>
+      <w:pPr>
+        <w:spacing w:after="160"/>
+      </w:pPr>
+      <w:r>
+        <w:rPr>
+          <w:b/>
+          <w:bCs/>
+          <w:sz w:val="21"/>
+          <w:szCs w:val="21"/>
+        </w:rPr>
+        <w:t xml:space="preserve">Conclusão e recomendação:</w:t>
+      </w:r>
+      <w:r>
+        <w:rPr>
+          <w:sz w:val="21"/>
+          <w:szCs w:val="21"/>
+        </w:rPr>
+        <w:t xml:space="preserve"> o preço parece bem calibrado para executivos, e arriscado (não necessariamente errado, mas não comprovado) para síndicos e fornecedores de menor porte. Sugiro monitorar a taxa de conversão por persona nas primeiras semanas de venda. Se síndico e fornecedor converterem muito abaixo de executivo, vale considerar uma oferta diferenciada por segmento (por exemplo, facilidades de pagamento específicas, ou uma versão de sessão mais curta e com ticket menor para esses dois públicos), em vez de manter um preço único para os três desde o início.</w:t>
+      </w:r>
+    </w:p>
+    <w:p>
+      <w:pPr>
         <w:pBdr>
           <w:bottom w:val="single" w:color="cccccc" w:sz="6" w:space="4"/>
         </w:pBdr>

</xml_diff>

<commit_message>
Corrige contexto de público e ajustes no documento de Sessão Estratégica/Diagnóstico
- Retira a "correção" indevida do termo "sua empresa de síndico" (está
  correto: o público é dono de empresa que presta serviço de síndico,
  não o autônomo pessoa física).
- Troca "promessa fraca" por "promessa vaga" em todo o documento.
- Reformula a análise de preço (seção 2.5) em torno do porte/capitalização
  da empresa por persona, não pessoa física vs. empresa.
- Adiciona seção 5 sobre a mudança do destino do botão de Agendar
  (WhatsApp da Jessie → checkout Hotmart), mantendo o WhatsApp flutuante.

Co-Authored-By: Claude Sonnet 5 <noreply@anthropic.com>
Claude-Session: https://claude.ai/code/session_01GQSqEjEuqv44iBdACeUWUZ
</commit_message>
<xml_diff>
--- a/eleva/analise-paginas-sessao-estrategica-diagnostico.docx
+++ b/eleva/analise-paginas-sessao-estrategica-diagnostico.docx
@@ -65,7 +65,44 @@
           <w:sz w:val="21"/>
           <w:szCs w:val="21"/>
         </w:rPr>
-        <w:t xml:space="preserve"> a Sessão Estratégica e o Diagnóstico passaram a ser pagos (R$700 e R$3.950). A Amanda avaliou que a promessa das páginas de Sessão Estratégica está fraca frente ao investimento, enquanto o Diagnóstico já está claro. Este documento reúne o que precisa ajustar em cada seção, e o motivo.</w:t>
+        <w:t xml:space="preserve"> a Sessão Estratégica e o Diagnóstico passaram a ser pagos (R$700 e R$3.950). A Amanda avaliou que a promessa das páginas de Sessão Estratégica está vaga e talvez não venda a ideia da sessão o suficiente frente ao investimento, enquanto o Diagnóstico já está claro. Este documento reúne o que precisa ajustar em cada seção, e o motivo.</w:t>
+      </w:r>
+    </w:p>
+    <w:p>
+      <w:pPr>
+        <w:spacing w:after="160"/>
+      </w:pPr>
+      <w:r>
+        <w:rPr>
+          <w:b/>
+          <w:bCs/>
+          <w:sz w:val="21"/>
+          <w:szCs w:val="21"/>
+        </w:rPr>
+        <w:t xml:space="preserve">Sobre o público:</w:t>
+      </w:r>
+      <w:r>
+        <w:rPr>
+          <w:sz w:val="21"/>
+          <w:szCs w:val="21"/>
+        </w:rPr>
+        <w:t xml:space="preserve"> o foco do Giuliano nas personas de síndico e fornecedor é o </w:t>
+      </w:r>
+      <w:r>
+        <w:rPr>
+          <w:b/>
+          <w:bCs/>
+          <w:sz w:val="21"/>
+          <w:szCs w:val="21"/>
+        </w:rPr>
+        <w:t xml:space="preserve">dono de empresa</w:t>
+      </w:r>
+      <w:r>
+        <w:rPr>
+          <w:sz w:val="21"/>
+          <w:szCs w:val="21"/>
+        </w:rPr>
+        <w:t xml:space="preserve"> que presta esse serviço (com CNPJ, podendo ter funcionário), não o profissional autônomo/pessoa física. Ou seja: empresa que presta serviço de síndico profissional, e empresa fornecedora/prestadora de serviço para condomínios. Isso é relevante tanto pro vocabulário das páginas quanto pra análise de preço (seção 2.5) — donos de administradora/imobiliária tendem a ter poder aquisitivo maior do que donos de empresa de síndico ou de empresa fornecedora, mesmo todos sendo donos de empresa.</w:t>
       </w:r>
     </w:p>
     <w:p>
@@ -431,7 +468,7 @@
         <w:spacing w:after="150" w:before="300"/>
       </w:pPr>
       <w:r>
-        <w:t xml:space="preserve">2. Sessão Estratégica — promessa fraca frente ao investimento</w:t>
+        <w:t xml:space="preserve">2. Sessão Estratégica — promessa vaga frente ao investimento</w:t>
       </w:r>
     </w:p>
     <w:p>
@@ -1025,6 +1062,34 @@
     </w:p>
     <w:p>
       <w:pPr>
+        <w:spacing w:after="160"/>
+      </w:pPr>
+      <w:r>
+        <w:rPr>
+          <w:sz w:val="21"/>
+          <w:szCs w:val="21"/>
+        </w:rPr>
+        <w:t xml:space="preserve">Nos três casos, o público é dono de empresa (não profissional autônomo), mas o </w:t>
+      </w:r>
+      <w:r>
+        <w:rPr>
+          <w:b/>
+          <w:bCs/>
+          <w:sz w:val="21"/>
+          <w:szCs w:val="21"/>
+        </w:rPr>
+        <w:t xml:space="preserve">porte e a capitalização da empresa variam bastante entre as personas</w:t>
+      </w:r>
+      <w:r>
+        <w:rPr>
+          <w:sz w:val="21"/>
+          <w:szCs w:val="21"/>
+        </w:rPr>
+        <w:t xml:space="preserve"> — isso é o que sustenta a diferença de sensibilidade a preço abaixo, não uma diferença entre "pessoa física" e "empresa".</w:t>
+      </w:r>
+    </w:p>
+    <w:p>
+      <w:pPr>
         <w:pStyle w:val="ListParagraph"/>
         <w:numPr>
           <w:ilvl w:val="0"/>
@@ -1046,59 +1111,59 @@
           <w:sz w:val="21"/>
           <w:szCs w:val="21"/>
         </w:rPr>
-        <w:t xml:space="preserve"> R$700 por 2h com um profissional com 35 anos de mercado e mais de 20 operações de M&amp;A está dentro, ou até abaixo, do que consultoria estratégica sênior costuma cobrar no Brasil (consultores seniores e especialistas em M&amp;A frequentemente cobram na faixa de R$300 a R$800+ por hora). Para esse público, que já lida com decisões de investimento maiores no negócio, o valor tende a ser bem recebido, e talvez até esteja subprecificado frente ao mercado.</w:t>
-      </w:r>
-    </w:p>
-    <w:p>
-      <w:pPr>
-        <w:pStyle w:val="ListParagraph"/>
-        <w:numPr>
-          <w:ilvl w:val="0"/>
-          <w:numId w:val="1"/>
-        </w:numPr>
-        <w:spacing w:after="80"/>
-      </w:pPr>
-      <w:r>
-        <w:rPr>
-          <w:b/>
-          <w:bCs/>
-          <w:sz w:val="21"/>
-          <w:szCs w:val="21"/>
-        </w:rPr>
-        <w:t xml:space="preserve">Síndicos profissionais:</w:t>
-      </w:r>
-      <w:r>
-        <w:rPr>
-          <w:sz w:val="21"/>
-          <w:szCs w:val="21"/>
-        </w:rPr>
-        <w:t xml:space="preserve"> público mais sensível a preço. A renda de um síndico profissional varia muito com o tamanho da carteira: quem já administra muitos condomínios tende a ver R$700 como investimento pequeno frente ao retorno possível; quem está começando (1 a 3 condomínios) pode achar alto para uma decisão isolada, principalmente já existindo o curso de R$297 como porta de entrada mais barata. O risco é filtrar só os síndicos já mais consolidados — o que não é necessariamente um problema (é público mais qualificado), mas reduz o volume de quem chega à sessão.</w:t>
-      </w:r>
-    </w:p>
-    <w:p>
-      <w:pPr>
-        <w:pStyle w:val="ListParagraph"/>
-        <w:numPr>
-          <w:ilvl w:val="0"/>
-          <w:numId w:val="1"/>
-        </w:numPr>
-        <w:spacing w:after="80"/>
-      </w:pPr>
-      <w:r>
-        <w:rPr>
-          <w:b/>
-          <w:bCs/>
-          <w:sz w:val="21"/>
-          <w:szCs w:val="21"/>
-        </w:rPr>
-        <w:t xml:space="preserve">Fornecedores e prestadores de serviço:</w:t>
-      </w:r>
-      <w:r>
-        <w:rPr>
-          <w:sz w:val="21"/>
-          <w:szCs w:val="21"/>
-        </w:rPr>
-        <w:t xml:space="preserve"> público heterogêneo, de operação pequena/local a empresa regional maior. Um fornecedor pequeno pode hesitar em pagar R$700 sem prova de retorno anterior; um fornecedor já vendendo em escala B2B tende a ver isso como custo baixo frente ao ticket de um contrato que pode fechar depois.</w:t>
+        <w:t xml:space="preserve"> R$700 por 2h com um profissional com 35 anos de mercado e mais de 20 operações de M&amp;A está dentro, ou até abaixo, do que consultoria estratégica sênior costuma cobrar no Brasil (consultores seniores e especialistas em M&amp;A frequentemente cobram na faixa de R$300 a R$800+ por hora). Administradoras e imobiliárias tendem a ser empresas de maior porte e faturamento entre as três personas, então esse público tem, em média, o maior poder aquisitivo pra decidir rápido. O valor tende a ser bem recebido, e talvez até esteja subprecificado frente ao mercado.</w:t>
+      </w:r>
+    </w:p>
+    <w:p>
+      <w:pPr>
+        <w:pStyle w:val="ListParagraph"/>
+        <w:numPr>
+          <w:ilvl w:val="0"/>
+          <w:numId w:val="1"/>
+        </w:numPr>
+        <w:spacing w:after="80"/>
+      </w:pPr>
+      <w:r>
+        <w:rPr>
+          <w:b/>
+          <w:bCs/>
+          <w:sz w:val="21"/>
+          <w:szCs w:val="21"/>
+        </w:rPr>
+        <w:t xml:space="preserve">Empresas de síndico profissional:</w:t>
+      </w:r>
+      <w:r>
+        <w:rPr>
+          <w:sz w:val="21"/>
+          <w:szCs w:val="21"/>
+        </w:rPr>
+        <w:t xml:space="preserve"> público mais sensível a preço que o executivo, mesmo sendo dono de empresa também. O porte varia muito com o tamanho da carteira de condomínios atendidos: uma empresa de síndico já consolidada, com carteira grande e funcionários, tende a ver R$700 como investimento pequeno frente ao retorno possível; uma empresa ainda pequena (carteira de 1 a 3 condomínios) pode achar alto para uma decisão isolada, principalmente já existindo o curso de R$297 como porta de entrada mais barata. O risco é filtrar só as empresas de síndico já mais consolidadas — o que não é necessariamente um problema (é público mais qualificado), mas reduz o volume de quem chega à sessão.</w:t>
+      </w:r>
+    </w:p>
+    <w:p>
+      <w:pPr>
+        <w:pStyle w:val="ListParagraph"/>
+        <w:numPr>
+          <w:ilvl w:val="0"/>
+          <w:numId w:val="1"/>
+        </w:numPr>
+        <w:spacing w:after="80"/>
+      </w:pPr>
+      <w:r>
+        <w:rPr>
+          <w:b/>
+          <w:bCs/>
+          <w:sz w:val="21"/>
+          <w:szCs w:val="21"/>
+        </w:rPr>
+        <w:t xml:space="preserve">Empresas fornecedoras e prestadoras de serviço para condomínios:</w:t>
+      </w:r>
+      <w:r>
+        <w:rPr>
+          <w:sz w:val="21"/>
+          <w:szCs w:val="21"/>
+        </w:rPr>
+        <w:t xml:space="preserve"> público heterogêneo, de operação pequena/local a empresa regional maior, geralmente com poder aquisitivo mais próximo do das empresas de síndico do que do das administradoras/imobiliárias. Uma empresa fornecedora pequena pode hesitar em pagar R$700 sem prova de retorno anterior; uma já vendendo em escala B2B tende a ver isso como custo baixo frente ao ticket de um contrato que pode fechar depois.</w:t>
       </w:r>
     </w:p>
     <w:p>
@@ -1119,7 +1184,7 @@
           <w:sz w:val="21"/>
           <w:szCs w:val="21"/>
         </w:rPr>
-        <w:t xml:space="preserve"> o preço parece bem calibrado para executivos, e arriscado (não necessariamente errado, mas não comprovado) para síndicos e fornecedores de menor porte. Sugiro monitorar a taxa de conversão por persona nas primeiras semanas de venda. Se síndico e fornecedor converterem muito abaixo de executivo, vale considerar uma oferta diferenciada por segmento (por exemplo, facilidades de pagamento específicas, ou uma versão de sessão mais curta e com ticket menor para esses dois públicos), em vez de manter um preço único para os três desde o início.</w:t>
+        <w:t xml:space="preserve"> o preço parece bem calibrado para executivos (maior poder aquisitivo médio entre as três personas), e arriscado, não necessariamente errado, mas não comprovado, para as empresas de síndico e de fornecimento de menor porte. Sugiro monitorar a taxa de conversão por persona nas primeiras semanas de venda. Se essas duas personas converterem muito abaixo do executivo, vale considerar uma oferta diferenciada por segmento (por exemplo, facilidades de pagamento específicas, ou uma versão de sessão mais curta e com ticket menor), em vez de manter um preço único para os três desde o início.</w:t>
       </w:r>
     </w:p>
     <w:p>
@@ -1148,126 +1213,40 @@
           <w:sz w:val="21"/>
           <w:szCs w:val="21"/>
         </w:rPr>
-        <w:t xml:space="preserve">A estrutura do Diagnóstico (H1 → por que fazer → como funciona → método em 5 etapas → o que você leva → prova social → próximo passo (Mentoria 8S) → FAQ → preço) já entrega uma promessa clara e concreta. Não recomendo mudar a estrutura, só 2 pontos:</w:t>
-      </w:r>
-    </w:p>
-    <w:p>
-      <w:pPr>
-        <w:spacing w:after="160"/>
-      </w:pPr>
-      <w:r>
-        <w:rPr>
-          <w:sz w:val="21"/>
-          <w:szCs w:val="21"/>
-        </w:rPr>
-        <w:t xml:space="preserve">### 3.1 Síndicos — H1 com termo errado</w:t>
-      </w:r>
-    </w:p>
-    <w:p>
-      <w:pPr>
-        <w:spacing w:after="160"/>
-      </w:pPr>
-      <w:r>
-        <w:rPr>
-          <w:b/>
-          <w:bCs/>
-          <w:sz w:val="21"/>
-          <w:szCs w:val="21"/>
-        </w:rPr>
-        <w:t xml:space="preserve">Como está:</w:t>
-      </w:r>
-      <w:r>
-        <w:rPr>
-          <w:sz w:val="21"/>
-          <w:szCs w:val="21"/>
-        </w:rPr>
-        <w:t xml:space="preserve"> "Descubra o que trava o crescimento da </w:t>
-      </w:r>
-      <w:r>
-        <w:rPr>
-          <w:b/>
-          <w:bCs/>
-          <w:sz w:val="21"/>
-          <w:szCs w:val="21"/>
-        </w:rPr>
-        <w:t xml:space="preserve">sua empresa de síndico</w:t>
-      </w:r>
-      <w:r>
-        <w:rPr>
-          <w:sz w:val="21"/>
-          <w:szCs w:val="21"/>
-        </w:rPr>
-        <w:t xml:space="preserve"> — em duas sessões."</w:t>
-      </w:r>
-    </w:p>
-    <w:p>
-      <w:pPr>
-        <w:spacing w:after="160"/>
-      </w:pPr>
-      <w:r>
-        <w:rPr>
-          <w:b/>
-          <w:bCs/>
-          <w:sz w:val="21"/>
-          <w:szCs w:val="21"/>
-        </w:rPr>
-        <w:t xml:space="preserve">Problema:</w:t>
-      </w:r>
-      <w:r>
-        <w:rPr>
-          <w:sz w:val="21"/>
-          <w:szCs w:val="21"/>
-        </w:rPr>
-        <w:t xml:space="preserve"> síndico não tem "empresa de síndico" — é um termo que não existe no vocabulário do próprio mercado, quebra a identificação.</w:t>
-      </w:r>
-    </w:p>
-    <w:p>
-      <w:pPr>
-        <w:spacing w:after="160"/>
-      </w:pPr>
-      <w:r>
-        <w:rPr>
-          <w:b/>
-          <w:bCs/>
-          <w:sz w:val="21"/>
-          <w:szCs w:val="21"/>
-        </w:rPr>
-        <w:t xml:space="preserve">Sugestão:</w:t>
-      </w:r>
-      <w:r>
-        <w:rPr>
-          <w:sz w:val="21"/>
-          <w:szCs w:val="21"/>
-        </w:rPr>
-        <w:t xml:space="preserve"> "Descubra o que trava o crescimento da </w:t>
-      </w:r>
-      <w:r>
-        <w:rPr>
-          <w:b/>
-          <w:bCs/>
-          <w:sz w:val="21"/>
-          <w:szCs w:val="21"/>
-        </w:rPr>
-        <w:t xml:space="preserve">sua atuação como síndico</w:t>
-      </w:r>
-      <w:r>
-        <w:rPr>
-          <w:sz w:val="21"/>
-          <w:szCs w:val="21"/>
-        </w:rPr>
-        <w:t xml:space="preserve"> — em duas sessões." (ou "da sua carteira", mantendo consistência com o ajuste já sugerido na Sessão Estratégica de síndicos).</w:t>
-      </w:r>
-    </w:p>
-    <w:p>
-      <w:pPr>
-        <w:spacing w:after="160"/>
-      </w:pPr>
-      <w:r>
-        <w:rPr>
-          <w:sz w:val="21"/>
-          <w:szCs w:val="21"/>
-        </w:rPr>
-        <w:t xml:space="preserve">### 3.2 Fornecedores — link duplicando "para"</w:t>
+        <w:t xml:space="preserve">A estrutura do Diagnóstico (H1 → por que fazer → como funciona → método em 5 etapas → o que você leva → prova social → próximo passo (Mentoria 8S) → FAQ → preço) já entrega uma promessa clara e concreta. Não recomendo mudar a estrutura, só 1 ponto:</w:t>
+      </w:r>
+    </w:p>
+    <w:p>
+      <w:pPr>
+        <w:spacing w:after="160"/>
+      </w:pPr>
+      <w:r>
+        <w:rPr>
+          <w:b/>
+          <w:bCs/>
+          <w:sz w:val="21"/>
+          <w:szCs w:val="21"/>
+        </w:rPr>
+        <w:t xml:space="preserve">Nota sobre o termo "sua empresa de síndico":</w:t>
+      </w:r>
+      <w:r>
+        <w:rPr>
+          <w:sz w:val="21"/>
+          <w:szCs w:val="21"/>
+        </w:rPr>
+        <w:t xml:space="preserve"> esse termo está correto e não precisa de ajuste — o público dessa persona é o dono de empresa que presta serviço de síndico profissional (com CNPJ, podendo ter funcionário), não o síndico autônomo pessoa física. Terminologia mantida como está.</w:t>
+      </w:r>
+    </w:p>
+    <w:p>
+      <w:pPr>
+        <w:spacing w:after="160"/>
+      </w:pPr>
+      <w:r>
+        <w:rPr>
+          <w:sz w:val="21"/>
+          <w:szCs w:val="21"/>
+        </w:rPr>
+        <w:t xml:space="preserve">### 3.1 Fornecedores — link duplicando "para"</w:t>
       </w:r>
     </w:p>
     <w:p>
@@ -1473,6 +1452,107 @@
           <w:szCs w:val="21"/>
         </w:rPr>
         <w:t xml:space="preserve">Essa é a régua de clareza que a Sessão Estratégica precisa alcançar, e a sugestão da seção 2 foi desenhada pra chegar nesse mesmo padrão.</w:t>
+      </w:r>
+    </w:p>
+    <w:p>
+      <w:pPr>
+        <w:pBdr>
+          <w:bottom w:val="single" w:color="cccccc" w:sz="6" w:space="4"/>
+        </w:pBdr>
+        <w:spacing w:after="200"/>
+      </w:pPr>
+    </w:p>
+    <w:p>
+      <w:pPr>
+        <w:pStyle w:val="Heading2"/>
+        <w:spacing w:after="150" w:before="300"/>
+      </w:pPr>
+      <w:r>
+        <w:t xml:space="preserve">5. Ajuste no destino do botão de Agendar (Sessão Estratégica e Diagnóstico)</w:t>
+      </w:r>
+    </w:p>
+    <w:p>
+      <w:pPr>
+        <w:spacing w:after="160"/>
+      </w:pPr>
+      <w:r>
+        <w:rPr>
+          <w:b/>
+          <w:bCs/>
+          <w:sz w:val="21"/>
+          <w:szCs w:val="21"/>
+        </w:rPr>
+        <w:t xml:space="preserve">Como está hoje:</w:t>
+      </w:r>
+      <w:r>
+        <w:rPr>
+          <w:sz w:val="21"/>
+          <w:szCs w:val="21"/>
+        </w:rPr>
+        <w:t xml:space="preserve"> o botão "Agendar minha Sessão Estratégica" (e o equivalente nas páginas de Diagnóstico) leva direto para o WhatsApp do comercial (Jessie).</w:t>
+      </w:r>
+    </w:p>
+    <w:p>
+      <w:pPr>
+        <w:spacing w:after="160"/>
+      </w:pPr>
+      <w:r>
+        <w:rPr>
+          <w:b/>
+          <w:bCs/>
+          <w:sz w:val="21"/>
+          <w:szCs w:val="21"/>
+        </w:rPr>
+        <w:t xml:space="preserve">Mudança em andamento:</w:t>
+      </w:r>
+      <w:r>
+        <w:rPr>
+          <w:sz w:val="21"/>
+          <w:szCs w:val="21"/>
+        </w:rPr>
+        <w:t xml:space="preserve"> a Amanda vai criar as ofertas de Sessão Estratégica dentro da Hotmart. A partir disso, esse botão passa a levar direto para o checkout de pagamento na Hotmart, em vez do WhatsApp.</w:t>
+      </w:r>
+    </w:p>
+    <w:p>
+      <w:pPr>
+        <w:spacing w:after="160"/>
+      </w:pPr>
+      <w:r>
+        <w:rPr>
+          <w:b/>
+          <w:bCs/>
+          <w:sz w:val="21"/>
+          <w:szCs w:val="21"/>
+        </w:rPr>
+        <w:t xml:space="preserve">O que continua igual:</w:t>
+      </w:r>
+      <w:r>
+        <w:rPr>
+          <w:sz w:val="21"/>
+          <w:szCs w:val="21"/>
+        </w:rPr>
+        <w:t xml:space="preserve"> o botão de WhatsApp flutuante (que já existe fixo na tela) continua direcionando para a Jessie normalmente.</w:t>
+      </w:r>
+    </w:p>
+    <w:p>
+      <w:pPr>
+        <w:spacing w:after="160"/>
+      </w:pPr>
+      <w:r>
+        <w:rPr>
+          <w:b/>
+          <w:bCs/>
+          <w:sz w:val="21"/>
+          <w:szCs w:val="21"/>
+        </w:rPr>
+        <w:t xml:space="preserve">Melhoria possível:</w:t>
+      </w:r>
+      <w:r>
+        <w:rPr>
+          <w:sz w:val="21"/>
+          <w:szCs w:val="21"/>
+        </w:rPr>
+        <w:t xml:space="preserve"> depois que a pessoa preencher o formulário ("se preferir, preencha o formulário e entraremos em contato"), pode aparecer também um botão de WhatsApp levando direto pra conversa com a Jessie, em vez de só ficar esperando o retorno.</w:t>
       </w:r>
     </w:p>
     <w:sectPr>

</xml_diff>

<commit_message>
Ajusta cabeçalho, público-alvo e headlines (framing de gargalo)
- Cabeçalho: "Recria - Agência de Marketing" e nome do cliente (Eleva).
- Reescreve o parágrafo "Sobre o público" com a curva B (autônomo) como
  cliente potencial das outras frentes do Eleva Group (Hub, Seguros).
- Headlines das 3 páginas de Sessão Estratégica reformuladas: "sair com
  o passo a passo pra resolver um gargalo" em vez de "resolução do que
  já pode ser feito agora", deixando explícito o escopo de 2h.

Co-Authored-By: Claude Sonnet 5 <noreply@anthropic.com>
Claude-Session: https://claude.ai/code/session_01GQSqEjEuqv44iBdACeUWUZ
</commit_message>
<xml_diff>
--- a/eleva/analise-paginas-sessao-estrategica-diagnostico.docx
+++ b/eleva/analise-paginas-sessao-estrategica-diagnostico.docx
@@ -23,7 +23,28 @@
           <w:sz w:val="18"/>
           <w:szCs w:val="18"/>
         </w:rPr>
-        <w:t xml:space="preserve">RECRIA Marketing, 09/09/2026</w:t>
+        <w:t xml:space="preserve">Recria - Agência de Marketing, 09/09/2026</w:t>
+      </w:r>
+    </w:p>
+    <w:p>
+      <w:pPr>
+        <w:spacing w:after="160"/>
+      </w:pPr>
+      <w:r>
+        <w:rPr>
+          <w:b/>
+          <w:bCs/>
+          <w:sz w:val="21"/>
+          <w:szCs w:val="21"/>
+        </w:rPr>
+        <w:t xml:space="preserve">Cliente:</w:t>
+      </w:r>
+      <w:r>
+        <w:rPr>
+          <w:sz w:val="21"/>
+          <w:szCs w:val="21"/>
+        </w:rPr>
+        <w:t xml:space="preserve"> Eleva</w:t>
       </w:r>
     </w:p>
     <w:p>
@@ -65,7 +86,7 @@
           <w:sz w:val="21"/>
           <w:szCs w:val="21"/>
         </w:rPr>
-        <w:t xml:space="preserve"> a Sessão Estratégica e o Diagnóstico passaram a ser pagos (R$700 e R$3.950). A Amanda avaliou que a promessa das páginas de Sessão Estratégica está vaga e talvez não venda a ideia da sessão o suficiente frente ao investimento, enquanto o Diagnóstico já está claro. Este documento reúne o que precisa ajustar em cada seção, e o motivo.</w:t>
+        <w:t xml:space="preserve"> a Sessão Estratégica e o Diagnóstico passaram a ser pagos (R$700 e R$3.950). A Amanda avaliou que a promessa das páginas de Sessão Estratégica está vaga e talvez não venda a ideia da sessão o suficiente frente ao investimento, enquanto o Diagnóstico já está claro. Este documento reúne sugestões de ajustes em cada seção, e o motivo.</w:t>
       </w:r>
     </w:p>
     <w:p>
@@ -86,7 +107,7 @@
           <w:sz w:val="21"/>
           <w:szCs w:val="21"/>
         </w:rPr>
-        <w:t xml:space="preserve"> o foco do Giuliano nas personas de síndico e fornecedor é o </w:t>
+        <w:t xml:space="preserve"> o foco do Giuliano nas personas de síndico e fornecedor é preferencialmente o </w:t>
       </w:r>
       <w:r>
         <w:rPr>
@@ -102,7 +123,7 @@
           <w:sz w:val="21"/>
           <w:szCs w:val="21"/>
         </w:rPr>
-        <w:t xml:space="preserve"> que presta esse serviço (com CNPJ, podendo ter funcionário), não o profissional autônomo/pessoa física. Ou seja: empresa que presta serviço de síndico profissional, e empresa fornecedora/prestadora de serviço para condomínios. Isso é relevante tanto pro vocabulário das páginas quanto pra análise de preço (seção 2.5) — donos de administradora/imobiliária tendem a ter poder aquisitivo maior do que donos de empresa de síndico ou de empresa fornecedora, mesmo todos sendo donos de empresa.</w:t>
+        <w:t xml:space="preserve"> que presta esse serviço (com CNPJ, podendo ter funcionário). O profissional autônomo/pessoa física, se tiver condições financeiras, entra como a curva B de persona/cliente da Eleva nas frentes de Sessão Estratégica, Diagnóstico ou Mentoria — mas é um cliente potencial como parceiro das outras frentes do Eleva Group, como o Hub e a Eleva Seguros. Isso é relevante tanto pro vocabulário das páginas quanto pra análise de preço (seção 2.5) — donos de administradora/imobiliária tendem a ter poder aquisitivo maior do que donos de empresa de síndico ou de empresa fornecedora, mesmo todos sendo donos de empresa.</w:t>
       </w:r>
     </w:p>
     <w:p>
@@ -530,6 +551,75 @@
       </w:pPr>
       <w:r>
         <w:rPr>
+          <w:b/>
+          <w:bCs/>
+          <w:sz w:val="21"/>
+          <w:szCs w:val="21"/>
+        </w:rPr>
+        <w:t xml:space="preserve">Lógica da promessa reformulada (vale pras 3 páginas):</w:t>
+      </w:r>
+      <w:r>
+        <w:rPr>
+          <w:sz w:val="21"/>
+          <w:szCs w:val="21"/>
+        </w:rPr>
+        <w:t xml:space="preserve"> em vez de prometer "a resolução do que já pode ser feito agora" (ainda meio genérico), a promessa fica em torno de </w:t>
+      </w:r>
+      <w:r>
+        <w:rPr>
+          <w:b/>
+          <w:bCs/>
+          <w:sz w:val="21"/>
+          <w:szCs w:val="21"/>
+        </w:rPr>
+        <w:t xml:space="preserve">um gargalo específico</w:t>
+      </w:r>
+      <w:r>
+        <w:rPr>
+          <w:sz w:val="21"/>
+          <w:szCs w:val="21"/>
+        </w:rPr>
+        <w:t xml:space="preserve">: em 2h, a pessoa sai com o passo a passo em andamento pra resolver </w:t>
+      </w:r>
+      <w:r>
+        <w:rPr>
+          <w:b/>
+          <w:bCs/>
+          <w:sz w:val="21"/>
+          <w:szCs w:val="21"/>
+        </w:rPr>
+        <w:t xml:space="preserve">um</w:t>
+      </w:r>
+      <w:r>
+        <w:rPr>
+          <w:sz w:val="21"/>
+          <w:szCs w:val="21"/>
+        </w:rPr>
+        <w:t xml:space="preserve"> ponto que está travando o negócio — não é possível resolver vários gargalos numa sessão só. Isso já deixa claro, sem precisar explicar depois, por que resolver </w:t>
+      </w:r>
+      <w:r>
+        <w:rPr>
+          <w:b/>
+          <w:bCs/>
+          <w:sz w:val="21"/>
+          <w:szCs w:val="21"/>
+        </w:rPr>
+        <w:t xml:space="preserve">múltiplos</w:t>
+      </w:r>
+      <w:r>
+        <w:rPr>
+          <w:sz w:val="21"/>
+          <w:szCs w:val="21"/>
+        </w:rPr>
+        <w:t xml:space="preserve"> gargalos é o papel do Diagnóstico ou da Mentoria.</w:t>
+      </w:r>
+    </w:p>
+    <w:p>
+      <w:pPr>
+        <w:spacing w:after="160"/>
+      </w:pPr>
+      <w:r>
+        <w:rPr>
           <w:sz w:val="21"/>
           <w:szCs w:val="21"/>
         </w:rPr>
@@ -614,7 +704,7 @@
           <w:sz w:val="21"/>
           <w:szCs w:val="21"/>
         </w:rPr>
-        <w:t xml:space="preserve">H1: "Em 2 horas, saia com a resolução do que já pode ser feito agora na sua administradora ou imobiliária"</w:t>
+        <w:t xml:space="preserve">H1: "Em 2 horas, saia com o passo a passo pra resolver um dos gargalos que pode estar travando o crescimento da sua administradora ou imobiliária"</w:t>
       </w:r>
     </w:p>
     <w:p>
@@ -652,7 +742,7 @@
           <w:sz w:val="21"/>
           <w:szCs w:val="21"/>
         </w:rPr>
-        <w:t xml:space="preserve"> troca "enxergar/situar" (vago) por "sair com a resolução" (concreto), e deixa claro que Diagnóstico/Mentoria são caminhos condicionais, não o destino padrão de toda sessão.</w:t>
+        <w:t xml:space="preserve"> troca "enxergar/situar" (vago) por "sair com o passo a passo pra resolver um gargalo" (concreto e delimitado), e deixa claro que Diagnóstico/Mentoria são caminhos condicionais, pra quando há mais de um gargalo a resolver, não o destino padrão de toda sessão.</w:t>
       </w:r>
     </w:p>
     <w:p>
@@ -745,7 +835,7 @@
           <w:sz w:val="21"/>
           <w:szCs w:val="21"/>
         </w:rPr>
-        <w:t xml:space="preserve">H1: "Em 2 horas, saia com a resolução do que já pode ser feito agora pra vender mais pra condomínios"</w:t>
+        <w:t xml:space="preserve">H1: "Em 2 horas, saia com o passo a passo pra resolver um dos gargalos que pode estar te impedindo de vender mais pra condomínios"</w:t>
       </w:r>
     </w:p>
     <w:p>
@@ -855,7 +945,7 @@
           <w:sz w:val="21"/>
           <w:szCs w:val="21"/>
         </w:rPr>
-        <w:t xml:space="preserve">H1: "Em 2 horas, saia com a resolução do que já pode ser feito agora na sua atuação como síndico profissional"</w:t>
+        <w:t xml:space="preserve">H1: "Em 2 horas, saia com o passo a passo pra resolver um dos gargalos que pode estar travando a sua atuação como síndico profissional"</w:t>
       </w:r>
     </w:p>
     <w:p>

</xml_diff>

<commit_message>
Adiciona seção 6: oferta alternativa (curso) pra quem não tem R$700 ainda
Sugestão de seção "ainda não é o momento pra Sessão Estratégica?" nas
páginas de síndico e fornecedor, oferecendo o curso de R$297
correspondente como rede de segurança, com botão pro checkout na
Hotmart. Não se aplica ao executivo (sem curso próprio).

Co-Authored-By: Claude Sonnet 5 <noreply@anthropic.com>
Claude-Session: https://claude.ai/code/session_01GQSqEjEuqv44iBdACeUWUZ
</commit_message>
<xml_diff>
--- a/eleva/analise-paginas-sessao-estrategica-diagnostico.docx
+++ b/eleva/analise-paginas-sessao-estrategica-diagnostico.docx
@@ -1645,6 +1645,290 @@
         <w:t xml:space="preserve"> depois que a pessoa preencher o formulário ("se preferir, preencha o formulário e entraremos em contato"), pode aparecer também um botão de WhatsApp levando direto pra conversa com a Jessie, em vez de só ficar esperando o retorno.</w:t>
       </w:r>
     </w:p>
+    <w:p>
+      <w:pPr>
+        <w:pBdr>
+          <w:bottom w:val="single" w:color="cccccc" w:sz="6" w:space="4"/>
+        </w:pBdr>
+        <w:spacing w:after="200"/>
+      </w:pPr>
+    </w:p>
+    <w:p>
+      <w:pPr>
+        <w:pStyle w:val="Heading2"/>
+        <w:spacing w:after="150" w:before="300"/>
+      </w:pPr>
+      <w:r>
+        <w:t xml:space="preserve">6. Sugestão adicional: alternativa pra quem ainda não tem R$700 (só síndico e fornecedor)</w:t>
+      </w:r>
+    </w:p>
+    <w:p>
+      <w:pPr>
+        <w:spacing w:after="160"/>
+      </w:pPr>
+      <w:r>
+        <w:rPr>
+          <w:b/>
+          <w:bCs/>
+          <w:sz w:val="21"/>
+          <w:szCs w:val="21"/>
+        </w:rPr>
+        <w:t xml:space="preserve">De onde vem:</w:t>
+      </w:r>
+      <w:r>
+        <w:rPr>
+          <w:sz w:val="21"/>
+          <w:szCs w:val="21"/>
+        </w:rPr>
+        <w:t xml:space="preserve"> direto da análise de preço da seção 2.5 — nas páginas de síndico e fornecedor, parte de quem chegar até a Sessão Estratégica pode não ter, hoje, os R$700 disponíveis pra decidir. Sem alternativa, esse lead se perde. Como já existe curso de entrada pras duas personas, dá pra reaproveitar essa oferta como rede de segurança na própria página, em vez de deixar a pessoa ir embora sem nada.</w:t>
+      </w:r>
+    </w:p>
+    <w:p>
+      <w:pPr>
+        <w:spacing w:after="160"/>
+      </w:pPr>
+      <w:r>
+        <w:rPr>
+          <w:b/>
+          <w:bCs/>
+          <w:sz w:val="21"/>
+          <w:szCs w:val="21"/>
+        </w:rPr>
+        <w:t xml:space="preserve">Onde inserir:</w:t>
+      </w:r>
+      <w:r>
+        <w:rPr>
+          <w:sz w:val="21"/>
+          <w:szCs w:val="21"/>
+        </w:rPr>
+        <w:t xml:space="preserve"> logo após o bloco de preço da Sessão Estratégica, só nas páginas de </w:t>
+      </w:r>
+      <w:r>
+        <w:rPr>
+          <w:b/>
+          <w:bCs/>
+          <w:sz w:val="21"/>
+          <w:szCs w:val="21"/>
+        </w:rPr>
+        <w:t xml:space="preserve">síndico</w:t>
+      </w:r>
+      <w:r>
+        <w:rPr>
+          <w:sz w:val="21"/>
+          <w:szCs w:val="21"/>
+        </w:rPr>
+        <w:t xml:space="preserve"> e </w:t>
+      </w:r>
+      <w:r>
+        <w:rPr>
+          <w:b/>
+          <w:bCs/>
+          <w:sz w:val="21"/>
+          <w:szCs w:val="21"/>
+        </w:rPr>
+        <w:t xml:space="preserve">fornecedor</w:t>
+      </w:r>
+      <w:r>
+        <w:rPr>
+          <w:sz w:val="21"/>
+          <w:szCs w:val="21"/>
+        </w:rPr>
+        <w:t xml:space="preserve"> (o executivo não tem curso próprio, então essa seção não se aplica a ele, mantém a página como está).</w:t>
+      </w:r>
+    </w:p>
+    <w:p>
+      <w:pPr>
+        <w:spacing w:after="80"/>
+      </w:pPr>
+      <w:r>
+        <w:rPr>
+          <w:i/>
+          <w:iCs/>
+          <w:color w:val="555555"/>
+          <w:sz w:val="18"/>
+          <w:szCs w:val="18"/>
+        </w:rPr>
+        <w:t xml:space="preserve">Sugestão de texto (síndico):</w:t>
+      </w:r>
+    </w:p>
+    <w:p>
+      <w:pPr>
+        <w:pBdr>
+          <w:left w:val="single" w:color="cccccc" w:sz="12" w:space="8"/>
+        </w:pBdr>
+        <w:spacing w:after="120"/>
+        <w:ind w:left="400"/>
+      </w:pPr>
+      <w:r>
+        <w:rPr>
+          <w:b/>
+          <w:bCs/>
+          <w:i/>
+          <w:iCs/>
+          <w:color w:val="333333"/>
+          <w:sz w:val="20"/>
+          <w:szCs w:val="20"/>
+        </w:rPr>
+        <w:t xml:space="preserve">Ainda não é o momento pra Sessão Estratégica?</w:t>
+      </w:r>
+    </w:p>
+    <w:p>
+      <w:pPr>
+        <w:pBdr>
+          <w:left w:val="single" w:color="cccccc" w:sz="12" w:space="8"/>
+        </w:pBdr>
+        <w:spacing w:after="120"/>
+        <w:ind w:left="400"/>
+      </w:pPr>
+      <w:r>
+        <w:rPr>
+          <w:i/>
+          <w:iCs/>
+          <w:color w:val="333333"/>
+          <w:sz w:val="20"/>
+          <w:szCs w:val="20"/>
+        </w:rPr>
+        <w:t xml:space="preserve">Se o investimento ainda não faz sentido pro momento da sua empresa, comece pelo Curso Avançado para Síndico Profissional, por R$297. Quando estiver pronto pra dar o próximo passo, você pode voltar e agendar sua Sessão Estratégica.</w:t>
+      </w:r>
+    </w:p>
+    <w:p>
+      <w:pPr>
+        <w:spacing w:after="160"/>
+      </w:pPr>
+      <w:r>
+        <w:rPr>
+          <w:sz w:val="21"/>
+          <w:szCs w:val="21"/>
+        </w:rPr>
+        <w:t xml:space="preserve">&gt;</w:t>
+      </w:r>
+    </w:p>
+    <w:p>
+      <w:pPr>
+        <w:pBdr>
+          <w:left w:val="single" w:color="cccccc" w:sz="12" w:space="8"/>
+        </w:pBdr>
+        <w:spacing w:after="120"/>
+        <w:ind w:left="400"/>
+      </w:pPr>
+      <w:r>
+        <w:rPr>
+          <w:i/>
+          <w:iCs/>
+          <w:color w:val="333333"/>
+          <w:sz w:val="20"/>
+          <w:szCs w:val="20"/>
+        </w:rPr>
+        <w:t xml:space="preserve">[Botão: Conhecer o Curso Avançado para Síndico Profissional →] (leva pro checkout do curso na Hotmart)</w:t>
+      </w:r>
+    </w:p>
+    <w:p>
+      <w:pPr>
+        <w:spacing w:after="80"/>
+      </w:pPr>
+      <w:r>
+        <w:rPr>
+          <w:i/>
+          <w:iCs/>
+          <w:color w:val="555555"/>
+          <w:sz w:val="18"/>
+          <w:szCs w:val="18"/>
+        </w:rPr>
+        <w:t xml:space="preserve">Sugestão de texto (fornecedor):</w:t>
+      </w:r>
+    </w:p>
+    <w:p>
+      <w:pPr>
+        <w:pBdr>
+          <w:left w:val="single" w:color="cccccc" w:sz="12" w:space="8"/>
+        </w:pBdr>
+        <w:spacing w:after="120"/>
+        <w:ind w:left="400"/>
+      </w:pPr>
+      <w:r>
+        <w:rPr>
+          <w:b/>
+          <w:bCs/>
+          <w:i/>
+          <w:iCs/>
+          <w:color w:val="333333"/>
+          <w:sz w:val="20"/>
+          <w:szCs w:val="20"/>
+        </w:rPr>
+        <w:t xml:space="preserve">Ainda não é o momento pra Sessão Estratégica?</w:t>
+      </w:r>
+    </w:p>
+    <w:p>
+      <w:pPr>
+        <w:pBdr>
+          <w:left w:val="single" w:color="cccccc" w:sz="12" w:space="8"/>
+        </w:pBdr>
+        <w:spacing w:after="120"/>
+        <w:ind w:left="400"/>
+      </w:pPr>
+      <w:r>
+        <w:rPr>
+          <w:i/>
+          <w:iCs/>
+          <w:color w:val="333333"/>
+          <w:sz w:val="20"/>
+          <w:szCs w:val="20"/>
+        </w:rPr>
+        <w:t xml:space="preserve">Se o investimento ainda não faz sentido pro momento da sua empresa, comece pelo curso Aprenda a Multiplicar Vendas para Condomínios, por R$297. Quando estiver pronto pra dar o próximo passo, você pode voltar e agendar sua Sessão Estratégica.</w:t>
+      </w:r>
+    </w:p>
+    <w:p>
+      <w:pPr>
+        <w:spacing w:after="160"/>
+      </w:pPr>
+      <w:r>
+        <w:rPr>
+          <w:sz w:val="21"/>
+          <w:szCs w:val="21"/>
+        </w:rPr>
+        <w:t xml:space="preserve">&gt;</w:t>
+      </w:r>
+    </w:p>
+    <w:p>
+      <w:pPr>
+        <w:pBdr>
+          <w:left w:val="single" w:color="cccccc" w:sz="12" w:space="8"/>
+        </w:pBdr>
+        <w:spacing w:after="120"/>
+        <w:ind w:left="400"/>
+      </w:pPr>
+      <w:r>
+        <w:rPr>
+          <w:i/>
+          <w:iCs/>
+          <w:color w:val="333333"/>
+          <w:sz w:val="20"/>
+          <w:szCs w:val="20"/>
+        </w:rPr>
+        <w:t xml:space="preserve">[Botão: Conhecer o curso Aprenda a Multiplicar Vendas para Condomínios →] (leva pro checkout do curso na Hotmart)</w:t>
+      </w:r>
+    </w:p>
+    <w:p>
+      <w:pPr>
+        <w:spacing w:after="160"/>
+      </w:pPr>
+      <w:r>
+        <w:rPr>
+          <w:b/>
+          <w:bCs/>
+          <w:sz w:val="21"/>
+          <w:szCs w:val="21"/>
+        </w:rPr>
+        <w:t xml:space="preserve">Por que funciona:</w:t>
+      </w:r>
+      <w:r>
+        <w:rPr>
+          <w:sz w:val="21"/>
+          <w:szCs w:val="21"/>
+        </w:rPr>
+        <w:t xml:space="preserve"> não é desconto disfarçado nem depreciação do produto principal — é uma segunda oferta, com produto e preço diferentes, pra quem realmente ainda não está no momento de pagar R$700. Quem compra o curso continua na base e pode ser trabalhado depois (e-mail, comunidade, redes) até estar pronto pra Sessão Estratégica, Diagnóstico ou Mentoria.</w:t>
+      </w:r>
+    </w:p>
     <w:sectPr>
       <w:pgSz w:w="11906" w:h="16838" w:orient="portrait"/>
       <w:pgMar w:top="1080" w:right="1080" w:bottom="1080" w:left="1080" w:header="708" w:footer="708" w:gutter="0"/>

</xml_diff>

<commit_message>
Remove contrações "pra/pro" e adiciona seção 7 (texto do formulário)
Troca "pra"/"pro"/"pras"/"pros" por "para"/"para o"/"para as"/"para os"
em todo o documento. Adiciona seção 7 com sugestão de texto para a
introdução do formulário, dando função clara a cada opção da página
(pagamento, WhatsApp, formulário).

Co-Authored-By: Claude Sonnet 5 <noreply@anthropic.com>
Claude-Session: https://claude.ai/code/session_01GQSqEjEuqv44iBdACeUWUZ
</commit_message>
<xml_diff>
--- a/eleva/analise-paginas-sessao-estrategica-diagnostico.docx
+++ b/eleva/analise-paginas-sessao-estrategica-diagnostico.docx
@@ -123,7 +123,7 @@
           <w:sz w:val="21"/>
           <w:szCs w:val="21"/>
         </w:rPr>
-        <w:t xml:space="preserve"> que presta esse serviço (com CNPJ, podendo ter funcionário). O profissional autônomo/pessoa física, se tiver condições financeiras, entra como a curva B de persona/cliente da Eleva nas frentes de Sessão Estratégica, Diagnóstico ou Mentoria — mas é um cliente potencial como parceiro das outras frentes do Eleva Group, como o Hub e a Eleva Seguros. Isso é relevante tanto pro vocabulário das páginas quanto pra análise de preço (seção 2.5) — donos de administradora/imobiliária tendem a ter poder aquisitivo maior do que donos de empresa de síndico ou de empresa fornecedora, mesmo todos sendo donos de empresa.</w:t>
+        <w:t xml:space="preserve"> que presta esse serviço (com CNPJ, podendo ter funcionário). O profissional autônomo/pessoa física, se tiver condições financeiras, entra como a curva B de persona/cliente da Eleva nas frentes de Sessão Estratégica, Diagnóstico ou Mentoria — mas é um cliente potencial como parceiro das outras frentes do Eleva Group, como o Hub e a Eleva Seguros. Isso é relevante tanto para o vocabulário das páginas quanto para análise de preço (seção 2.5) — donos de administradora/imobiliária tendem a ter poder aquisitivo maior do que donos de empresa de síndico ou de empresa fornecedora, mesmo todos sendo donos de empresa.</w:t>
       </w:r>
     </w:p>
     <w:p>
@@ -556,7 +556,7 @@
           <w:sz w:val="21"/>
           <w:szCs w:val="21"/>
         </w:rPr>
-        <w:t xml:space="preserve">Lógica da promessa reformulada (vale pras 3 páginas):</w:t>
+        <w:t xml:space="preserve">Lógica da promessa reformulada (vale para as 3 páginas):</w:t>
       </w:r>
       <w:r>
         <w:rPr>
@@ -579,7 +579,7 @@
           <w:sz w:val="21"/>
           <w:szCs w:val="21"/>
         </w:rPr>
-        <w:t xml:space="preserve">: em 2h, a pessoa sai com o passo a passo em andamento pra resolver </w:t>
+        <w:t xml:space="preserve">: em 2h, a pessoa sai com o passo a passo em andamento para resolver </w:t>
       </w:r>
       <w:r>
         <w:rPr>
@@ -704,7 +704,7 @@
           <w:sz w:val="21"/>
           <w:szCs w:val="21"/>
         </w:rPr>
-        <w:t xml:space="preserve">H1: "Em 2 horas, saia com o passo a passo pra resolver um dos gargalos que pode estar travando o crescimento da sua administradora ou imobiliária"</w:t>
+        <w:t xml:space="preserve">H1: "Em 2 horas, saia com o passo a passo para resolver um dos gargalos que pode estar travando o crescimento da sua administradora ou imobiliária"</w:t>
       </w:r>
     </w:p>
     <w:p>
@@ -721,7 +721,7 @@
           <w:sz w:val="21"/>
           <w:szCs w:val="21"/>
         </w:rPr>
-        <w:t xml:space="preserve">Subhead: "Giuliano Spolavori entende o cenário do seu negócio e já entrega, na própria sessão, o encaminhamento prático pro que for possível resolver nessas 2h. Se a questão pedir mais profundidade, você sai sabendo exatamente se o caminho certo é um Diagnóstico ou uma Mentoria."</w:t>
+        <w:t xml:space="preserve">Subhead: "Giuliano Spolavori entende o cenário do seu negócio e já entrega, na própria sessão, o encaminhamento prático para o que for possível resolver nessas 2h. Se a questão pedir mais profundidade, você sai sabendo exatamente se o caminho certo é um Diagnóstico ou uma Mentoria."</w:t>
       </w:r>
     </w:p>
     <w:p>
@@ -742,7 +742,7 @@
           <w:sz w:val="21"/>
           <w:szCs w:val="21"/>
         </w:rPr>
-        <w:t xml:space="preserve"> troca "enxergar/situar" (vago) por "sair com o passo a passo pra resolver um gargalo" (concreto e delimitado), e deixa claro que Diagnóstico/Mentoria são caminhos condicionais, pra quando há mais de um gargalo a resolver, não o destino padrão de toda sessão.</w:t>
+        <w:t xml:space="preserve"> troca "enxergar/situar" (vago) por "sair com o passo a passo para resolver um gargalo" (concreto e delimitado), e deixa claro que Diagnóstico/Mentoria são caminhos condicionais, para quando há mais de um gargalo a resolver, não o destino padrão de toda sessão.</w:t>
       </w:r>
     </w:p>
     <w:p>
@@ -835,7 +835,7 @@
           <w:sz w:val="21"/>
           <w:szCs w:val="21"/>
         </w:rPr>
-        <w:t xml:space="preserve">H1: "Em 2 horas, saia com o passo a passo pra resolver um dos gargalos que pode estar te impedindo de vender mais pra condomínios"</w:t>
+        <w:t xml:space="preserve">H1: "Em 2 horas, saia com o passo a passo para resolver um dos gargalos que pode estar te impedindo de vender mais para condomínios"</w:t>
       </w:r>
     </w:p>
     <w:p>
@@ -852,7 +852,7 @@
           <w:sz w:val="21"/>
           <w:szCs w:val="21"/>
         </w:rPr>
-        <w:t xml:space="preserve">Subhead: "Giuliano Spolavori entende o cenário da sua empresa e já entrega, na própria sessão, o encaminhamento prático pro que for possível resolver nessas 2h. Se a questão pedir mais profundidade, você sai sabendo exatamente se o caminho certo é um Diagnóstico ou uma Mentoria."</w:t>
+        <w:t xml:space="preserve">Subhead: "Giuliano Spolavori entende o cenário da sua empresa e já entrega, na própria sessão, o encaminhamento prático para o que for possível resolver nessas 2h. Se a questão pedir mais profundidade, você sai sabendo exatamente se o caminho certo é um Diagnóstico ou uma Mentoria."</w:t>
       </w:r>
     </w:p>
     <w:p>
@@ -945,7 +945,7 @@
           <w:sz w:val="21"/>
           <w:szCs w:val="21"/>
         </w:rPr>
-        <w:t xml:space="preserve">H1: "Em 2 horas, saia com o passo a passo pra resolver um dos gargalos que pode estar travando a sua atuação como síndico profissional"</w:t>
+        <w:t xml:space="preserve">H1: "Em 2 horas, saia com o passo a passo para resolver um dos gargalos que pode estar travando a sua atuação como síndico profissional"</w:t>
       </w:r>
     </w:p>
     <w:p>
@@ -962,7 +962,7 @@
           <w:sz w:val="21"/>
           <w:szCs w:val="21"/>
         </w:rPr>
-        <w:t xml:space="preserve">Subhead: "Giuliano Spolavori entende o cenário da sua carteira e já entrega, na própria sessão, o encaminhamento prático pro que for possível resolver nessas 2h. Se a questão pedir mais profundidade, você sai sabendo exatamente se o caminho certo é um Diagnóstico ou uma Mentoria."</w:t>
+        <w:t xml:space="preserve">Subhead: "Giuliano Spolavori entende o cenário da sua carteira e já entrega, na própria sessão, o encaminhamento prático para o que for possível resolver nessas 2h. Se a questão pedir mais profundidade, você sai sabendo exatamente se o caminho certo é um Diagnóstico ou uma Mentoria."</w:t>
       </w:r>
     </w:p>
     <w:p>
@@ -1047,7 +1047,7 @@
           <w:sz w:val="21"/>
           <w:szCs w:val="21"/>
         </w:rPr>
-        <w:t xml:space="preserve"> confirma a mesma vaguidão do H1 ("enxergando caminhos") e faz parecer que a sessão só entrega o mapa, empurrando pra outro produto pago em qualquer situação.</w:t>
+        <w:t xml:space="preserve"> confirma a mesma vaguidão do H1 ("enxergando caminhos") e faz parecer que a sessão só entrega o mapa, empurrando para outro produto pago em qualquer situação.</w:t>
       </w:r>
     </w:p>
     <w:p>
@@ -1201,7 +1201,7 @@
           <w:sz w:val="21"/>
           <w:szCs w:val="21"/>
         </w:rPr>
-        <w:t xml:space="preserve"> R$700 por 2h com um profissional com 35 anos de mercado e mais de 20 operações de M&amp;A está dentro, ou até abaixo, do que consultoria estratégica sênior costuma cobrar no Brasil (consultores seniores e especialistas em M&amp;A frequentemente cobram na faixa de R$300 a R$800+ por hora). Administradoras e imobiliárias tendem a ser empresas de maior porte e faturamento entre as três personas, então esse público tem, em média, o maior poder aquisitivo pra decidir rápido. O valor tende a ser bem recebido, e talvez até esteja subprecificado frente ao mercado.</w:t>
+        <w:t xml:space="preserve"> R$700 por 2h com um profissional com 35 anos de mercado e mais de 20 operações de M&amp;A está dentro, ou até abaixo, do que consultoria estratégica sênior costuma cobrar no Brasil (consultores seniores e especialistas em M&amp;A frequentemente cobram na faixa de R$300 a R$800+ por hora). Administradoras e imobiliárias tendem a ser empresas de maior porte e faturamento entre as três personas, então esse público tem, em média, o maior poder aquisitivo para decidir rápido. O valor tende a ser bem recebido, e talvez até esteja subprecificado frente ao mercado.</w:t>
       </w:r>
     </w:p>
     <w:p>
@@ -1512,7 +1512,7 @@
           <w:sz w:val="21"/>
           <w:szCs w:val="21"/>
         </w:rPr>
-        <w:t xml:space="preserve">FAQ antecipa objeções reais (funciona pra qualquer porte? é igual à Mentoria? como fica a confidencialidade?)</w:t>
+        <w:t xml:space="preserve">FAQ antecipa objeções reais (funciona para qualquer porte? é igual à Mentoria? como fica a confidencialidade?)</w:t>
       </w:r>
     </w:p>
     <w:p>
@@ -1529,19 +1529,19 @@
           <w:sz w:val="21"/>
           <w:szCs w:val="21"/>
         </w:rPr>
-        <w:t xml:space="preserve">Deixa claro que o Diagnóstico não é consultoria nem mentoria, e que o valor pago é 100% creditado se avançar pra Mentoria 8S em até 30 dias — remove o medo de "pagar duas vezes"</w:t>
-      </w:r>
-    </w:p>
-    <w:p>
-      <w:pPr>
-        <w:spacing w:after="160"/>
-      </w:pPr>
-      <w:r>
-        <w:rPr>
-          <w:sz w:val="21"/>
-          <w:szCs w:val="21"/>
-        </w:rPr>
-        <w:t xml:space="preserve">Essa é a régua de clareza que a Sessão Estratégica precisa alcançar, e a sugestão da seção 2 foi desenhada pra chegar nesse mesmo padrão.</w:t>
+        <w:t xml:space="preserve">Deixa claro que o Diagnóstico não é consultoria nem mentoria, e que o valor pago é 100% creditado se avançar para Mentoria 8S em até 30 dias — remove o medo de "pagar duas vezes"</w:t>
+      </w:r>
+    </w:p>
+    <w:p>
+      <w:pPr>
+        <w:spacing w:after="160"/>
+      </w:pPr>
+      <w:r>
+        <w:rPr>
+          <w:sz w:val="21"/>
+          <w:szCs w:val="21"/>
+        </w:rPr>
+        <w:t xml:space="preserve">Essa é a régua de clareza que a Sessão Estratégica precisa alcançar, e a sugestão da seção 2 foi desenhada para chegar nesse mesmo padrão.</w:t>
       </w:r>
     </w:p>
     <w:p>
@@ -1642,7 +1642,7 @@
           <w:sz w:val="21"/>
           <w:szCs w:val="21"/>
         </w:rPr>
-        <w:t xml:space="preserve"> depois que a pessoa preencher o formulário ("se preferir, preencha o formulário e entraremos em contato"), pode aparecer também um botão de WhatsApp levando direto pra conversa com a Jessie, em vez de só ficar esperando o retorno.</w:t>
+        <w:t xml:space="preserve"> depois que a pessoa preencher o formulário ("se preferir, preencha o formulário e entraremos em contato"), pode aparecer também um botão de WhatsApp levando direto para conversa com a Jessie, em vez de só ficar esperando o retorno.</w:t>
       </w:r>
     </w:p>
     <w:p>
@@ -1659,7 +1659,7 @@
         <w:spacing w:after="150" w:before="300"/>
       </w:pPr>
       <w:r>
-        <w:t xml:space="preserve">6. Sugestão adicional: alternativa pra quem ainda não tem R$700 (só síndico e fornecedor)</w:t>
+        <w:t xml:space="preserve">6. Sugestão adicional: alternativa para quem ainda não tem R$700 (só síndico e fornecedor)</w:t>
       </w:r>
     </w:p>
     <w:p>
@@ -1680,7 +1680,7 @@
           <w:sz w:val="21"/>
           <w:szCs w:val="21"/>
         </w:rPr>
-        <w:t xml:space="preserve"> direto da análise de preço da seção 2.5 — nas páginas de síndico e fornecedor, parte de quem chegar até a Sessão Estratégica pode não ter, hoje, os R$700 disponíveis pra decidir. Sem alternativa, esse lead se perde. Como já existe curso de entrada pras duas personas, dá pra reaproveitar essa oferta como rede de segurança na própria página, em vez de deixar a pessoa ir embora sem nada.</w:t>
+        <w:t xml:space="preserve"> direto da análise de preço da seção 2.5 — nas páginas de síndico e fornecedor, parte de quem chegar até a Sessão Estratégica pode não ter, hoje, os R$700 disponíveis para decidir. Sem alternativa, esse lead se perde. Como já existe curso de entrada para as duas personas, dá para reaproveitar essa oferta como rede de segurança na própria página, em vez de deixar a pessoa ir embora sem nada.</w:t>
       </w:r>
     </w:p>
     <w:p>
@@ -1769,7 +1769,7 @@
           <w:sz w:val="20"/>
           <w:szCs w:val="20"/>
         </w:rPr>
-        <w:t xml:space="preserve">Ainda não é o momento pra Sessão Estratégica?</w:t>
+        <w:t xml:space="preserve">Ainda não é o momento para Sessão Estratégica?</w:t>
       </w:r>
     </w:p>
     <w:p>
@@ -1788,7 +1788,7 @@
           <w:sz w:val="20"/>
           <w:szCs w:val="20"/>
         </w:rPr>
-        <w:t xml:space="preserve">Se o investimento ainda não faz sentido pro momento da sua empresa, comece pelo Curso Avançado para Síndico Profissional, por R$297. Quando estiver pronto pra dar o próximo passo, você pode voltar e agendar sua Sessão Estratégica.</w:t>
+        <w:t xml:space="preserve">Se o investimento ainda não faz sentido para o momento da sua empresa, comece pelo Curso Avançado para Síndico Profissional, por R$297. Quando estiver pronto para dar o próximo passo, você pode voltar e agendar sua Sessão Estratégica.</w:t>
       </w:r>
     </w:p>
     <w:p>
@@ -1819,7 +1819,7 @@
           <w:sz w:val="20"/>
           <w:szCs w:val="20"/>
         </w:rPr>
-        <w:t xml:space="preserve">[Botão: Conhecer o Curso Avançado para Síndico Profissional →] (leva pro checkout do curso na Hotmart)</w:t>
+        <w:t xml:space="preserve">[Botão: Conhecer o Curso Avançado para Síndico Profissional →] (leva para o checkout do curso na Hotmart)</w:t>
       </w:r>
     </w:p>
     <w:p>
@@ -1855,7 +1855,7 @@
           <w:sz w:val="20"/>
           <w:szCs w:val="20"/>
         </w:rPr>
-        <w:t xml:space="preserve">Ainda não é o momento pra Sessão Estratégica?</w:t>
+        <w:t xml:space="preserve">Ainda não é o momento para Sessão Estratégica?</w:t>
       </w:r>
     </w:p>
     <w:p>
@@ -1874,7 +1874,7 @@
           <w:sz w:val="20"/>
           <w:szCs w:val="20"/>
         </w:rPr>
-        <w:t xml:space="preserve">Se o investimento ainda não faz sentido pro momento da sua empresa, comece pelo curso Aprenda a Multiplicar Vendas para Condomínios, por R$297. Quando estiver pronto pra dar o próximo passo, você pode voltar e agendar sua Sessão Estratégica.</w:t>
+        <w:t xml:space="preserve">Se o investimento ainda não faz sentido para o momento da sua empresa, comece pelo curso Aprenda a Multiplicar Vendas para Condomínios, por R$297. Quando estiver pronto para dar o próximo passo, você pode voltar e agendar sua Sessão Estratégica.</w:t>
       </w:r>
     </w:p>
     <w:p>
@@ -1905,7 +1905,7 @@
           <w:sz w:val="20"/>
           <w:szCs w:val="20"/>
         </w:rPr>
-        <w:t xml:space="preserve">[Botão: Conhecer o curso Aprenda a Multiplicar Vendas para Condomínios →] (leva pro checkout do curso na Hotmart)</w:t>
+        <w:t xml:space="preserve">[Botão: Conhecer o curso Aprenda a Multiplicar Vendas para Condomínios →] (leva para o checkout do curso na Hotmart)</w:t>
       </w:r>
     </w:p>
     <w:p>
@@ -1926,7 +1926,100 @@
           <w:sz w:val="21"/>
           <w:szCs w:val="21"/>
         </w:rPr>
-        <w:t xml:space="preserve"> não é desconto disfarçado nem depreciação do produto principal — é uma segunda oferta, com produto e preço diferentes, pra quem realmente ainda não está no momento de pagar R$700. Quem compra o curso continua na base e pode ser trabalhado depois (e-mail, comunidade, redes) até estar pronto pra Sessão Estratégica, Diagnóstico ou Mentoria.</w:t>
+        <w:t xml:space="preserve"> não é desconto disfarçado nem depreciação do produto principal — é uma segunda oferta, com produto e preço diferentes, para quem realmente ainda não está no momento de pagar R$700. Quem compra o curso continua na base e pode ser trabalhado depois (e-mail, comunidade, redes) até estar pronto para Sessão Estratégica, Diagnóstico ou Mentoria.</w:t>
+      </w:r>
+    </w:p>
+    <w:p>
+      <w:pPr>
+        <w:pBdr>
+          <w:bottom w:val="single" w:color="cccccc" w:sz="6" w:space="4"/>
+        </w:pBdr>
+        <w:spacing w:after="200"/>
+      </w:pPr>
+    </w:p>
+    <w:p>
+      <w:pPr>
+        <w:pStyle w:val="Heading2"/>
+        <w:spacing w:after="150" w:before="300"/>
+      </w:pPr>
+      <w:r>
+        <w:t xml:space="preserve">7. Ajuste no texto de introdução do formulário (Sessão Estratégica e Diagnóstico)</w:t>
+      </w:r>
+    </w:p>
+    <w:p>
+      <w:pPr>
+        <w:spacing w:after="160"/>
+      </w:pPr>
+      <w:r>
+        <w:rPr>
+          <w:b/>
+          <w:bCs/>
+          <w:sz w:val="21"/>
+          <w:szCs w:val="21"/>
+        </w:rPr>
+        <w:t xml:space="preserve">Como está hoje:</w:t>
+      </w:r>
+      <w:r>
+        <w:rPr>
+          <w:sz w:val="21"/>
+          <w:szCs w:val="21"/>
+        </w:rPr>
+        <w:t xml:space="preserve"> "Se preferir, preencha o formulário e entraremos em contato." — não dá nenhum motivo pra usar o formulário em vez de pagar direto ou chamar no WhatsApp, fica sem função clara ao lado das outras opções.</w:t>
+      </w:r>
+    </w:p>
+    <w:p>
+      <w:pPr>
+        <w:spacing w:after="80"/>
+      </w:pPr>
+      <w:r>
+        <w:rPr>
+          <w:i/>
+          <w:iCs/>
+          <w:color w:val="555555"/>
+          <w:sz w:val="18"/>
+          <w:szCs w:val="18"/>
+        </w:rPr>
+        <w:t xml:space="preserve">Sugestão:</w:t>
+      </w:r>
+    </w:p>
+    <w:p>
+      <w:pPr>
+        <w:pBdr>
+          <w:left w:val="single" w:color="cccccc" w:sz="12" w:space="8"/>
+        </w:pBdr>
+        <w:spacing w:after="120"/>
+        <w:ind w:left="400"/>
+      </w:pPr>
+      <w:r>
+        <w:rPr>
+          <w:i/>
+          <w:iCs/>
+          <w:color w:val="333333"/>
+          <w:sz w:val="20"/>
+          <w:szCs w:val="20"/>
+        </w:rPr>
+        <w:t xml:space="preserve">Ainda está em dúvida se a sessão é para você? Ou gostaria de tirar uma dúvida antes de adquirir? Preencha o formulário que o nosso time comercial vai te atender.</w:t>
+      </w:r>
+    </w:p>
+    <w:p>
+      <w:pPr>
+        <w:spacing w:after="160"/>
+      </w:pPr>
+      <w:r>
+        <w:rPr>
+          <w:b/>
+          <w:bCs/>
+          <w:sz w:val="21"/>
+          <w:szCs w:val="21"/>
+        </w:rPr>
+        <w:t xml:space="preserve">Por quê:</w:t>
+      </w:r>
+      <w:r>
+        <w:rPr>
+          <w:sz w:val="21"/>
+          <w:szCs w:val="21"/>
+        </w:rPr>
+        <w:t xml:space="preserve"> dá um motivo específico pra usar o formulário (dúvida, não decisão de compra ainda), diferenciando esse caminho do botão de pagamento direto e do WhatsApp flutuante — cada opção da página passa a ter uma função clara: pagar (Hotmart), tirar dúvida rápida (WhatsApp) ou tirar dúvida mais detalhada por escrito (formulário).</w:t>
       </w:r>
     </w:p>
     <w:sectPr>

</xml_diff>

<commit_message>
Reordena documento: agrupa toda a parte de Sessão Estratégica antes do Diagnóstico
Move a seção "alternativa para quem não tem R$700" para dentro do bloco
de Sessão Estratégica (2.6), evitando ida e volta entre os dois temas.
Diagnóstico e demais seções renumeradas em sequência. Deixa explícito
que a seção do texto de formulário vale para as 6 páginas (Sessão
Estratégica e Diagnóstico).

Co-Authored-By: Claude Sonnet 5 <noreply@anthropic.com>
Claude-Session: https://claude.ai/code/session_01GQSqEjEuqv44iBdACeUWUZ
</commit_message>
<xml_diff>
--- a/eleva/analise-paginas-sessao-estrategica-diagnostico.docx
+++ b/eleva/analise-paginas-sessao-estrategica-diagnostico.docx
@@ -123,7 +123,7 @@
           <w:sz w:val="21"/>
           <w:szCs w:val="21"/>
         </w:rPr>
-        <w:t xml:space="preserve"> que presta esse serviço (com CNPJ, podendo ter funcionário). O profissional autônomo/pessoa física, se tiver condições financeiras, entra como a curva B de persona/cliente da Eleva nas frentes de Sessão Estratégica, Diagnóstico ou Mentoria — mas é um cliente potencial como parceiro das outras frentes do Eleva Group, como o Hub e a Eleva Seguros. Isso é relevante tanto para o vocabulário das páginas quanto para análise de preço (seção 2.5) — donos de administradora/imobiliária tendem a ter poder aquisitivo maior do que donos de empresa de síndico ou de empresa fornecedora, mesmo todos sendo donos de empresa.</w:t>
+        <w:t xml:space="preserve"> que presta esse serviço (com CNPJ, podendo ter funcionário). O profissional autônomo/pessoa física, se tiver condições financeiras, entra como a curva B de persona/cliente da Eleva nas frentes de Sessão Estratégica, Diagnóstico ou Mentoria — mas é um cliente potencial como parceiro das outras frentes do Eleva Group, como o Hub e a Eleva Seguros. Isso é relevante tanto para o vocabulário das páginas quanto para a análise de preço (seção 2.5) — donos de administradora/imobiliária tendem a ter poder aquisitivo maior do que donos de empresa de síndico ou de empresa fornecedora, mesmo todos sendo donos de empresa.</w:t>
       </w:r>
     </w:p>
     <w:p>
@@ -1279,6 +1279,285 @@
     </w:p>
     <w:p>
       <w:pPr>
+        <w:spacing w:after="160"/>
+      </w:pPr>
+      <w:r>
+        <w:rPr>
+          <w:sz w:val="21"/>
+          <w:szCs w:val="21"/>
+        </w:rPr>
+        <w:t xml:space="preserve">### 2.6 Alternativa para quem ainda não tem R$700 (só síndico e fornecedor)</w:t>
+      </w:r>
+    </w:p>
+    <w:p>
+      <w:pPr>
+        <w:spacing w:after="160"/>
+      </w:pPr>
+      <w:r>
+        <w:rPr>
+          <w:b/>
+          <w:bCs/>
+          <w:sz w:val="21"/>
+          <w:szCs w:val="21"/>
+        </w:rPr>
+        <w:t xml:space="preserve">De onde vem:</w:t>
+      </w:r>
+      <w:r>
+        <w:rPr>
+          <w:sz w:val="21"/>
+          <w:szCs w:val="21"/>
+        </w:rPr>
+        <w:t xml:space="preserve"> direto da análise de preço da seção 2.5 — nas páginas de síndico e fornecedor, parte de quem chegar até a Sessão Estratégica pode não ter, hoje, os R$700 disponíveis para decidir. Sem alternativa, esse lead se perde. Como já existe curso de entrada para as duas personas, dá para reaproveitar essa oferta como rede de segurança na própria página, em vez de deixar a pessoa ir embora sem nada.</w:t>
+      </w:r>
+    </w:p>
+    <w:p>
+      <w:pPr>
+        <w:spacing w:after="160"/>
+      </w:pPr>
+      <w:r>
+        <w:rPr>
+          <w:b/>
+          <w:bCs/>
+          <w:sz w:val="21"/>
+          <w:szCs w:val="21"/>
+        </w:rPr>
+        <w:t xml:space="preserve">Onde inserir:</w:t>
+      </w:r>
+      <w:r>
+        <w:rPr>
+          <w:sz w:val="21"/>
+          <w:szCs w:val="21"/>
+        </w:rPr>
+        <w:t xml:space="preserve"> logo após o bloco de preço da Sessão Estratégica, só nas páginas de </w:t>
+      </w:r>
+      <w:r>
+        <w:rPr>
+          <w:b/>
+          <w:bCs/>
+          <w:sz w:val="21"/>
+          <w:szCs w:val="21"/>
+        </w:rPr>
+        <w:t xml:space="preserve">síndico</w:t>
+      </w:r>
+      <w:r>
+        <w:rPr>
+          <w:sz w:val="21"/>
+          <w:szCs w:val="21"/>
+        </w:rPr>
+        <w:t xml:space="preserve"> e </w:t>
+      </w:r>
+      <w:r>
+        <w:rPr>
+          <w:b/>
+          <w:bCs/>
+          <w:sz w:val="21"/>
+          <w:szCs w:val="21"/>
+        </w:rPr>
+        <w:t xml:space="preserve">fornecedor</w:t>
+      </w:r>
+      <w:r>
+        <w:rPr>
+          <w:sz w:val="21"/>
+          <w:szCs w:val="21"/>
+        </w:rPr>
+        <w:t xml:space="preserve"> (o executivo não tem curso próprio, então essa seção não se aplica a ele, mantém a página como está).</w:t>
+      </w:r>
+    </w:p>
+    <w:p>
+      <w:pPr>
+        <w:spacing w:after="80"/>
+      </w:pPr>
+      <w:r>
+        <w:rPr>
+          <w:i/>
+          <w:iCs/>
+          <w:color w:val="555555"/>
+          <w:sz w:val="18"/>
+          <w:szCs w:val="18"/>
+        </w:rPr>
+        <w:t xml:space="preserve">Sugestão de texto (síndico):</w:t>
+      </w:r>
+    </w:p>
+    <w:p>
+      <w:pPr>
+        <w:pBdr>
+          <w:left w:val="single" w:color="cccccc" w:sz="12" w:space="8"/>
+        </w:pBdr>
+        <w:spacing w:after="120"/>
+        <w:ind w:left="400"/>
+      </w:pPr>
+      <w:r>
+        <w:rPr>
+          <w:b/>
+          <w:bCs/>
+          <w:i/>
+          <w:iCs/>
+          <w:color w:val="333333"/>
+          <w:sz w:val="20"/>
+          <w:szCs w:val="20"/>
+        </w:rPr>
+        <w:t xml:space="preserve">Ainda não é o momento para Sessão Estratégica?</w:t>
+      </w:r>
+    </w:p>
+    <w:p>
+      <w:pPr>
+        <w:pBdr>
+          <w:left w:val="single" w:color="cccccc" w:sz="12" w:space="8"/>
+        </w:pBdr>
+        <w:spacing w:after="120"/>
+        <w:ind w:left="400"/>
+      </w:pPr>
+      <w:r>
+        <w:rPr>
+          <w:i/>
+          <w:iCs/>
+          <w:color w:val="333333"/>
+          <w:sz w:val="20"/>
+          <w:szCs w:val="20"/>
+        </w:rPr>
+        <w:t xml:space="preserve">Se o investimento ainda não faz sentido para o momento da sua empresa, comece pelo Curso Avançado para Síndico Profissional, por R$297. Quando estiver pronto para dar o próximo passo, você pode voltar e agendar sua Sessão Estratégica.</w:t>
+      </w:r>
+    </w:p>
+    <w:p>
+      <w:pPr>
+        <w:spacing w:after="160"/>
+      </w:pPr>
+      <w:r>
+        <w:rPr>
+          <w:sz w:val="21"/>
+          <w:szCs w:val="21"/>
+        </w:rPr>
+        <w:t xml:space="preserve">&gt;</w:t>
+      </w:r>
+    </w:p>
+    <w:p>
+      <w:pPr>
+        <w:pBdr>
+          <w:left w:val="single" w:color="cccccc" w:sz="12" w:space="8"/>
+        </w:pBdr>
+        <w:spacing w:after="120"/>
+        <w:ind w:left="400"/>
+      </w:pPr>
+      <w:r>
+        <w:rPr>
+          <w:i/>
+          <w:iCs/>
+          <w:color w:val="333333"/>
+          <w:sz w:val="20"/>
+          <w:szCs w:val="20"/>
+        </w:rPr>
+        <w:t xml:space="preserve">[Botão: Conhecer o Curso Avançado para Síndico Profissional →] (leva para o checkout do curso na Hotmart)</w:t>
+      </w:r>
+    </w:p>
+    <w:p>
+      <w:pPr>
+        <w:spacing w:after="80"/>
+      </w:pPr>
+      <w:r>
+        <w:rPr>
+          <w:i/>
+          <w:iCs/>
+          <w:color w:val="555555"/>
+          <w:sz w:val="18"/>
+          <w:szCs w:val="18"/>
+        </w:rPr>
+        <w:t xml:space="preserve">Sugestão de texto (fornecedor):</w:t>
+      </w:r>
+    </w:p>
+    <w:p>
+      <w:pPr>
+        <w:pBdr>
+          <w:left w:val="single" w:color="cccccc" w:sz="12" w:space="8"/>
+        </w:pBdr>
+        <w:spacing w:after="120"/>
+        <w:ind w:left="400"/>
+      </w:pPr>
+      <w:r>
+        <w:rPr>
+          <w:b/>
+          <w:bCs/>
+          <w:i/>
+          <w:iCs/>
+          <w:color w:val="333333"/>
+          <w:sz w:val="20"/>
+          <w:szCs w:val="20"/>
+        </w:rPr>
+        <w:t xml:space="preserve">Ainda não é o momento para Sessão Estratégica?</w:t>
+      </w:r>
+    </w:p>
+    <w:p>
+      <w:pPr>
+        <w:pBdr>
+          <w:left w:val="single" w:color="cccccc" w:sz="12" w:space="8"/>
+        </w:pBdr>
+        <w:spacing w:after="120"/>
+        <w:ind w:left="400"/>
+      </w:pPr>
+      <w:r>
+        <w:rPr>
+          <w:i/>
+          <w:iCs/>
+          <w:color w:val="333333"/>
+          <w:sz w:val="20"/>
+          <w:szCs w:val="20"/>
+        </w:rPr>
+        <w:t xml:space="preserve">Se o investimento ainda não faz sentido para o momento da sua empresa, comece pelo curso Aprenda a Multiplicar Vendas para Condomínios, por R$297. Quando estiver pronto para dar o próximo passo, você pode voltar e agendar sua Sessão Estratégica.</w:t>
+      </w:r>
+    </w:p>
+    <w:p>
+      <w:pPr>
+        <w:spacing w:after="160"/>
+      </w:pPr>
+      <w:r>
+        <w:rPr>
+          <w:sz w:val="21"/>
+          <w:szCs w:val="21"/>
+        </w:rPr>
+        <w:t xml:space="preserve">&gt;</w:t>
+      </w:r>
+    </w:p>
+    <w:p>
+      <w:pPr>
+        <w:pBdr>
+          <w:left w:val="single" w:color="cccccc" w:sz="12" w:space="8"/>
+        </w:pBdr>
+        <w:spacing w:after="120"/>
+        <w:ind w:left="400"/>
+      </w:pPr>
+      <w:r>
+        <w:rPr>
+          <w:i/>
+          <w:iCs/>
+          <w:color w:val="333333"/>
+          <w:sz w:val="20"/>
+          <w:szCs w:val="20"/>
+        </w:rPr>
+        <w:t xml:space="preserve">[Botão: Conhecer o curso Aprenda a Multiplicar Vendas para Condomínios →] (leva para o checkout do curso na Hotmart)</w:t>
+      </w:r>
+    </w:p>
+    <w:p>
+      <w:pPr>
+        <w:spacing w:after="160"/>
+      </w:pPr>
+      <w:r>
+        <w:rPr>
+          <w:b/>
+          <w:bCs/>
+          <w:sz w:val="21"/>
+          <w:szCs w:val="21"/>
+        </w:rPr>
+        <w:t xml:space="preserve">Por que funciona:</w:t>
+      </w:r>
+      <w:r>
+        <w:rPr>
+          <w:sz w:val="21"/>
+          <w:szCs w:val="21"/>
+        </w:rPr>
+        <w:t xml:space="preserve"> não é desconto disfarçado nem depreciação do produto principal — é uma segunda oferta, com produto e preço diferentes, para quem realmente ainda não está no momento de pagar R$700. Quem compra o curso continua na base e pode ser trabalhado depois (e-mail, comunidade, redes) até estar pronto para Sessão Estratégica, Diagnóstico ou Mentoria.</w:t>
+      </w:r>
+    </w:p>
+    <w:p>
+      <w:pPr>
         <w:pBdr>
           <w:bottom w:val="single" w:color="cccccc" w:sz="6" w:space="4"/>
         </w:pBdr>
@@ -1529,7 +1808,7 @@
           <w:sz w:val="21"/>
           <w:szCs w:val="21"/>
         </w:rPr>
-        <w:t xml:space="preserve">Deixa claro que o Diagnóstico não é consultoria nem mentoria, e que o valor pago é 100% creditado se avançar para Mentoria 8S em até 30 dias — remove o medo de "pagar duas vezes"</w:t>
+        <w:t xml:space="preserve">Deixa claro que o Diagnóstico não é consultoria nem mentoria, e que o valor pago é 100% creditado se avançar para a Mentoria 8S em até 30 dias — remove o medo de "pagar duas vezes"</w:t>
       </w:r>
     </w:p>
     <w:p>
@@ -1642,7 +1921,7 @@
           <w:sz w:val="21"/>
           <w:szCs w:val="21"/>
         </w:rPr>
-        <w:t xml:space="preserve"> depois que a pessoa preencher o formulário ("se preferir, preencha o formulário e entraremos em contato"), pode aparecer também um botão de WhatsApp levando direto para conversa com a Jessie, em vez de só ficar esperando o retorno.</w:t>
+        <w:t xml:space="preserve"> depois que a pessoa preencher o formulário ("se preferir, preencha o formulário e entraremos em contato"), pode aparecer também um botão de WhatsApp levando direto para a conversa com a Jessie, em vez de só ficar esperando o retorno.</w:t>
       </w:r>
     </w:p>
     <w:p>
@@ -1659,81 +1938,40 @@
         <w:spacing w:after="150" w:before="300"/>
       </w:pPr>
       <w:r>
-        <w:t xml:space="preserve">6. Sugestão adicional: alternativa para quem ainda não tem R$700 (só síndico e fornecedor)</w:t>
-      </w:r>
-    </w:p>
-    <w:p>
-      <w:pPr>
-        <w:spacing w:after="160"/>
-      </w:pPr>
-      <w:r>
-        <w:rPr>
-          <w:b/>
-          <w:bCs/>
-          <w:sz w:val="21"/>
-          <w:szCs w:val="21"/>
-        </w:rPr>
-        <w:t xml:space="preserve">De onde vem:</w:t>
-      </w:r>
-      <w:r>
-        <w:rPr>
-          <w:sz w:val="21"/>
-          <w:szCs w:val="21"/>
-        </w:rPr>
-        <w:t xml:space="preserve"> direto da análise de preço da seção 2.5 — nas páginas de síndico e fornecedor, parte de quem chegar até a Sessão Estratégica pode não ter, hoje, os R$700 disponíveis para decidir. Sem alternativa, esse lead se perde. Como já existe curso de entrada para as duas personas, dá para reaproveitar essa oferta como rede de segurança na própria página, em vez de deixar a pessoa ir embora sem nada.</w:t>
-      </w:r>
-    </w:p>
-    <w:p>
-      <w:pPr>
-        <w:spacing w:after="160"/>
-      </w:pPr>
-      <w:r>
-        <w:rPr>
-          <w:b/>
-          <w:bCs/>
-          <w:sz w:val="21"/>
-          <w:szCs w:val="21"/>
-        </w:rPr>
-        <w:t xml:space="preserve">Onde inserir:</w:t>
-      </w:r>
-      <w:r>
-        <w:rPr>
-          <w:sz w:val="21"/>
-          <w:szCs w:val="21"/>
-        </w:rPr>
-        <w:t xml:space="preserve"> logo após o bloco de preço da Sessão Estratégica, só nas páginas de </w:t>
-      </w:r>
-      <w:r>
-        <w:rPr>
-          <w:b/>
-          <w:bCs/>
-          <w:sz w:val="21"/>
-          <w:szCs w:val="21"/>
-        </w:rPr>
-        <w:t xml:space="preserve">síndico</w:t>
-      </w:r>
-      <w:r>
-        <w:rPr>
-          <w:sz w:val="21"/>
-          <w:szCs w:val="21"/>
-        </w:rPr>
-        <w:t xml:space="preserve"> e </w:t>
-      </w:r>
-      <w:r>
-        <w:rPr>
-          <w:b/>
-          <w:bCs/>
-          <w:sz w:val="21"/>
-          <w:szCs w:val="21"/>
-        </w:rPr>
-        <w:t xml:space="preserve">fornecedor</w:t>
-      </w:r>
-      <w:r>
-        <w:rPr>
-          <w:sz w:val="21"/>
-          <w:szCs w:val="21"/>
-        </w:rPr>
-        <w:t xml:space="preserve"> (o executivo não tem curso próprio, então essa seção não se aplica a ele, mantém a página como está).</w:t>
+        <w:t xml:space="preserve">6. Ajuste no texto de introdução do formulário (Sessão Estratégica e Diagnóstico)</w:t>
+      </w:r>
+    </w:p>
+    <w:p>
+      <w:pPr>
+        <w:spacing w:after="160"/>
+      </w:pPr>
+      <w:r>
+        <w:rPr>
+          <w:sz w:val="21"/>
+          <w:szCs w:val="21"/>
+        </w:rPr>
+        <w:t xml:space="preserve">Vale para as 6 páginas (Sessão Estratégica e Diagnóstico, nas 3 personas) — o formulário é o mesmo template em todas.</w:t>
+      </w:r>
+    </w:p>
+    <w:p>
+      <w:pPr>
+        <w:spacing w:after="160"/>
+      </w:pPr>
+      <w:r>
+        <w:rPr>
+          <w:b/>
+          <w:bCs/>
+          <w:sz w:val="21"/>
+          <w:szCs w:val="21"/>
+        </w:rPr>
+        <w:t xml:space="preserve">Como está hoje:</w:t>
+      </w:r>
+      <w:r>
+        <w:rPr>
+          <w:sz w:val="21"/>
+          <w:szCs w:val="21"/>
+        </w:rPr>
+        <w:t xml:space="preserve"> "Se preferir, preencha o formulário e entraremos em contato." — não dá nenhum motivo para usar o formulário em vez de pagar direto ou chamar no WhatsApp, fica sem função clara ao lado das outras opções.</w:t>
       </w:r>
     </w:p>
     <w:p>
@@ -1748,7 +1986,7 @@
           <w:sz w:val="18"/>
           <w:szCs w:val="18"/>
         </w:rPr>
-        <w:t xml:space="preserve">Sugestão de texto (síndico):</w:t>
+        <w:t xml:space="preserve">Sugestão:</w:t>
       </w:r>
     </w:p>
     <w:p>
@@ -1761,243 +1999,12 @@
       </w:pPr>
       <w:r>
         <w:rPr>
-          <w:b/>
-          <w:bCs/>
           <w:i/>
           <w:iCs/>
           <w:color w:val="333333"/>
           <w:sz w:val="20"/>
           <w:szCs w:val="20"/>
         </w:rPr>
-        <w:t xml:space="preserve">Ainda não é o momento para Sessão Estratégica?</w:t>
-      </w:r>
-    </w:p>
-    <w:p>
-      <w:pPr>
-        <w:pBdr>
-          <w:left w:val="single" w:color="cccccc" w:sz="12" w:space="8"/>
-        </w:pBdr>
-        <w:spacing w:after="120"/>
-        <w:ind w:left="400"/>
-      </w:pPr>
-      <w:r>
-        <w:rPr>
-          <w:i/>
-          <w:iCs/>
-          <w:color w:val="333333"/>
-          <w:sz w:val="20"/>
-          <w:szCs w:val="20"/>
-        </w:rPr>
-        <w:t xml:space="preserve">Se o investimento ainda não faz sentido para o momento da sua empresa, comece pelo Curso Avançado para Síndico Profissional, por R$297. Quando estiver pronto para dar o próximo passo, você pode voltar e agendar sua Sessão Estratégica.</w:t>
-      </w:r>
-    </w:p>
-    <w:p>
-      <w:pPr>
-        <w:spacing w:after="160"/>
-      </w:pPr>
-      <w:r>
-        <w:rPr>
-          <w:sz w:val="21"/>
-          <w:szCs w:val="21"/>
-        </w:rPr>
-        <w:t xml:space="preserve">&gt;</w:t>
-      </w:r>
-    </w:p>
-    <w:p>
-      <w:pPr>
-        <w:pBdr>
-          <w:left w:val="single" w:color="cccccc" w:sz="12" w:space="8"/>
-        </w:pBdr>
-        <w:spacing w:after="120"/>
-        <w:ind w:left="400"/>
-      </w:pPr>
-      <w:r>
-        <w:rPr>
-          <w:i/>
-          <w:iCs/>
-          <w:color w:val="333333"/>
-          <w:sz w:val="20"/>
-          <w:szCs w:val="20"/>
-        </w:rPr>
-        <w:t xml:space="preserve">[Botão: Conhecer o Curso Avançado para Síndico Profissional →] (leva para o checkout do curso na Hotmart)</w:t>
-      </w:r>
-    </w:p>
-    <w:p>
-      <w:pPr>
-        <w:spacing w:after="80"/>
-      </w:pPr>
-      <w:r>
-        <w:rPr>
-          <w:i/>
-          <w:iCs/>
-          <w:color w:val="555555"/>
-          <w:sz w:val="18"/>
-          <w:szCs w:val="18"/>
-        </w:rPr>
-        <w:t xml:space="preserve">Sugestão de texto (fornecedor):</w:t>
-      </w:r>
-    </w:p>
-    <w:p>
-      <w:pPr>
-        <w:pBdr>
-          <w:left w:val="single" w:color="cccccc" w:sz="12" w:space="8"/>
-        </w:pBdr>
-        <w:spacing w:after="120"/>
-        <w:ind w:left="400"/>
-      </w:pPr>
-      <w:r>
-        <w:rPr>
-          <w:b/>
-          <w:bCs/>
-          <w:i/>
-          <w:iCs/>
-          <w:color w:val="333333"/>
-          <w:sz w:val="20"/>
-          <w:szCs w:val="20"/>
-        </w:rPr>
-        <w:t xml:space="preserve">Ainda não é o momento para Sessão Estratégica?</w:t>
-      </w:r>
-    </w:p>
-    <w:p>
-      <w:pPr>
-        <w:pBdr>
-          <w:left w:val="single" w:color="cccccc" w:sz="12" w:space="8"/>
-        </w:pBdr>
-        <w:spacing w:after="120"/>
-        <w:ind w:left="400"/>
-      </w:pPr>
-      <w:r>
-        <w:rPr>
-          <w:i/>
-          <w:iCs/>
-          <w:color w:val="333333"/>
-          <w:sz w:val="20"/>
-          <w:szCs w:val="20"/>
-        </w:rPr>
-        <w:t xml:space="preserve">Se o investimento ainda não faz sentido para o momento da sua empresa, comece pelo curso Aprenda a Multiplicar Vendas para Condomínios, por R$297. Quando estiver pronto para dar o próximo passo, você pode voltar e agendar sua Sessão Estratégica.</w:t>
-      </w:r>
-    </w:p>
-    <w:p>
-      <w:pPr>
-        <w:spacing w:after="160"/>
-      </w:pPr>
-      <w:r>
-        <w:rPr>
-          <w:sz w:val="21"/>
-          <w:szCs w:val="21"/>
-        </w:rPr>
-        <w:t xml:space="preserve">&gt;</w:t>
-      </w:r>
-    </w:p>
-    <w:p>
-      <w:pPr>
-        <w:pBdr>
-          <w:left w:val="single" w:color="cccccc" w:sz="12" w:space="8"/>
-        </w:pBdr>
-        <w:spacing w:after="120"/>
-        <w:ind w:left="400"/>
-      </w:pPr>
-      <w:r>
-        <w:rPr>
-          <w:i/>
-          <w:iCs/>
-          <w:color w:val="333333"/>
-          <w:sz w:val="20"/>
-          <w:szCs w:val="20"/>
-        </w:rPr>
-        <w:t xml:space="preserve">[Botão: Conhecer o curso Aprenda a Multiplicar Vendas para Condomínios →] (leva para o checkout do curso na Hotmart)</w:t>
-      </w:r>
-    </w:p>
-    <w:p>
-      <w:pPr>
-        <w:spacing w:after="160"/>
-      </w:pPr>
-      <w:r>
-        <w:rPr>
-          <w:b/>
-          <w:bCs/>
-          <w:sz w:val="21"/>
-          <w:szCs w:val="21"/>
-        </w:rPr>
-        <w:t xml:space="preserve">Por que funciona:</w:t>
-      </w:r>
-      <w:r>
-        <w:rPr>
-          <w:sz w:val="21"/>
-          <w:szCs w:val="21"/>
-        </w:rPr>
-        <w:t xml:space="preserve"> não é desconto disfarçado nem depreciação do produto principal — é uma segunda oferta, com produto e preço diferentes, para quem realmente ainda não está no momento de pagar R$700. Quem compra o curso continua na base e pode ser trabalhado depois (e-mail, comunidade, redes) até estar pronto para Sessão Estratégica, Diagnóstico ou Mentoria.</w:t>
-      </w:r>
-    </w:p>
-    <w:p>
-      <w:pPr>
-        <w:pBdr>
-          <w:bottom w:val="single" w:color="cccccc" w:sz="6" w:space="4"/>
-        </w:pBdr>
-        <w:spacing w:after="200"/>
-      </w:pPr>
-    </w:p>
-    <w:p>
-      <w:pPr>
-        <w:pStyle w:val="Heading2"/>
-        <w:spacing w:after="150" w:before="300"/>
-      </w:pPr>
-      <w:r>
-        <w:t xml:space="preserve">7. Ajuste no texto de introdução do formulário (Sessão Estratégica e Diagnóstico)</w:t>
-      </w:r>
-    </w:p>
-    <w:p>
-      <w:pPr>
-        <w:spacing w:after="160"/>
-      </w:pPr>
-      <w:r>
-        <w:rPr>
-          <w:b/>
-          <w:bCs/>
-          <w:sz w:val="21"/>
-          <w:szCs w:val="21"/>
-        </w:rPr>
-        <w:t xml:space="preserve">Como está hoje:</w:t>
-      </w:r>
-      <w:r>
-        <w:rPr>
-          <w:sz w:val="21"/>
-          <w:szCs w:val="21"/>
-        </w:rPr>
-        <w:t xml:space="preserve"> "Se preferir, preencha o formulário e entraremos em contato." — não dá nenhum motivo pra usar o formulário em vez de pagar direto ou chamar no WhatsApp, fica sem função clara ao lado das outras opções.</w:t>
-      </w:r>
-    </w:p>
-    <w:p>
-      <w:pPr>
-        <w:spacing w:after="80"/>
-      </w:pPr>
-      <w:r>
-        <w:rPr>
-          <w:i/>
-          <w:iCs/>
-          <w:color w:val="555555"/>
-          <w:sz w:val="18"/>
-          <w:szCs w:val="18"/>
-        </w:rPr>
-        <w:t xml:space="preserve">Sugestão:</w:t>
-      </w:r>
-    </w:p>
-    <w:p>
-      <w:pPr>
-        <w:pBdr>
-          <w:left w:val="single" w:color="cccccc" w:sz="12" w:space="8"/>
-        </w:pBdr>
-        <w:spacing w:after="120"/>
-        <w:ind w:left="400"/>
-      </w:pPr>
-      <w:r>
-        <w:rPr>
-          <w:i/>
-          <w:iCs/>
-          <w:color w:val="333333"/>
-          <w:sz w:val="20"/>
-          <w:szCs w:val="20"/>
-        </w:rPr>
         <w:t xml:space="preserve">Ainda está em dúvida se a sessão é para você? Ou gostaria de tirar uma dúvida antes de adquirir? Preencha o formulário que o nosso time comercial vai te atender.</w:t>
       </w:r>
     </w:p>
@@ -2019,7 +2026,7 @@
           <w:sz w:val="21"/>
           <w:szCs w:val="21"/>
         </w:rPr>
-        <w:t xml:space="preserve"> dá um motivo específico pra usar o formulário (dúvida, não decisão de compra ainda), diferenciando esse caminho do botão de pagamento direto e do WhatsApp flutuante — cada opção da página passa a ter uma função clara: pagar (Hotmart), tirar dúvida rápida (WhatsApp) ou tirar dúvida mais detalhada por escrito (formulário).</w:t>
+        <w:t xml:space="preserve"> dá um motivo específico para usar o formulário (dúvida, não decisão de compra ainda), diferenciando esse caminho do botão de pagamento direto e do WhatsApp flutuante — cada opção da página passa a ter uma função clara: pagar (Hotmart), tirar dúvida rápida (WhatsApp) ou tirar dúvida mais detalhada por escrito (formulário).</w:t>
       </w:r>
     </w:p>
     <w:sectPr>

</xml_diff>

<commit_message>
Ajusta conclusão da análise de preço: preço único é estratégia deliberada
Remove a sugestão de precificação diferenciada por segmento — o Giuliano
já usa o preço único de propósito, como filtro de qualificação de lead,
com o curso de entrada como alternativa para quem não está pronto (seção 2.6).

Co-Authored-By: Claude Sonnet 5 <noreply@anthropic.com>
Claude-Session: https://claude.ai/code/session_01GQSqEjEuqv44iBdACeUWUZ
</commit_message>
<xml_diff>
--- a/eleva/analise-paginas-sessao-estrategica-diagnostico.docx
+++ b/eleva/analise-paginas-sessao-estrategica-diagnostico.docx
@@ -1267,14 +1267,14 @@
           <w:sz w:val="21"/>
           <w:szCs w:val="21"/>
         </w:rPr>
-        <w:t xml:space="preserve">Conclusão e recomendação:</w:t>
-      </w:r>
-      <w:r>
-        <w:rPr>
-          <w:sz w:val="21"/>
-          <w:szCs w:val="21"/>
-        </w:rPr>
-        <w:t xml:space="preserve"> o preço parece bem calibrado para executivos (maior poder aquisitivo médio entre as três personas), e arriscado, não necessariamente errado, mas não comprovado, para as empresas de síndico e de fornecimento de menor porte. Sugiro monitorar a taxa de conversão por persona nas primeiras semanas de venda. Se essas duas personas converterem muito abaixo do executivo, vale considerar uma oferta diferenciada por segmento (por exemplo, facilidades de pagamento específicas, ou uma versão de sessão mais curta e com ticket menor), em vez de manter um preço único para os três desde o início.</w:t>
+        <w:t xml:space="preserve">Conclusão:</w:t>
+      </w:r>
+      <w:r>
+        <w:rPr>
+          <w:sz w:val="21"/>
+          <w:szCs w:val="21"/>
+        </w:rPr>
+        <w:t xml:space="preserve"> o preço parece bem calibrado para executivos (maior poder aquisitivo médio entre as três personas), e mais desafiador para as empresas de síndico e de fornecimento de menor porte. Esse ponto já está considerado na estratégia do Giuliano: o preço único para as três personas é deliberado, funcionando como filtro de qualificação de lead — quem não está no momento de pagar Sessão Estratégica, Diagnóstico ou Mentoria, compra o curso de entrada (R$297) primeiro (ver seção 2.6).</w:t>
       </w:r>
     </w:p>
     <w:p>

</xml_diff>

<commit_message>
Diferencia texto do formulário por tipo de página e referencia o WhatsApp flutuante
Seção 6 agora traz versão específica para Sessão Estratégica e para
Diagnóstico, apontando para o botão de WhatsApp flutuante já existente
em vez de sugerir um botão novo (ajuste correspondente na seção 5).

Co-Authored-By: Claude Sonnet 5 <noreply@anthropic.com>
Claude-Session: https://claude.ai/code/session_01GQSqEjEuqv44iBdACeUWUZ
</commit_message>
<xml_diff>
--- a/eleva/analise-paginas-sessao-estrategica-diagnostico.docx
+++ b/eleva/analise-paginas-sessao-estrategica-diagnostico.docx
@@ -1914,14 +1914,14 @@
           <w:sz w:val="21"/>
           <w:szCs w:val="21"/>
         </w:rPr>
-        <w:t xml:space="preserve">Melhoria possível:</w:t>
-      </w:r>
-      <w:r>
-        <w:rPr>
-          <w:sz w:val="21"/>
-          <w:szCs w:val="21"/>
-        </w:rPr>
-        <w:t xml:space="preserve"> depois que a pessoa preencher o formulário ("se preferir, preencha o formulário e entraremos em contato"), pode aparecer também um botão de WhatsApp levando direto para a conversa com a Jessie, em vez de só ficar esperando o retorno.</w:t>
+        <w:t xml:space="preserve">Sobre o WhatsApp após o formulário:</w:t>
+      </w:r>
+      <w:r>
+        <w:rPr>
+          <w:sz w:val="21"/>
+          <w:szCs w:val="21"/>
+        </w:rPr>
+        <w:t xml:space="preserve"> não é preciso criar um botão novo — o botão de WhatsApp flutuante já cobre esse caso. O ajuste é só no texto (ver seção 6), deixando claro pra quem preferir chamar direto em vez de esperar retorno pelo formulário.</w:t>
       </w:r>
     </w:p>
     <w:p>
@@ -1971,7 +1971,7 @@
           <w:sz w:val="21"/>
           <w:szCs w:val="21"/>
         </w:rPr>
-        <w:t xml:space="preserve"> "Se preferir, preencha o formulário e entraremos em contato." — não dá nenhum motivo para usar o formulário em vez de pagar direto ou chamar no WhatsApp, fica sem função clara ao lado das outras opções.</w:t>
+        <w:t xml:space="preserve"> "Se preferir, preencha o formulário e entraremos em contato." — não dá nenhum motivo para usar o formulário em vez de pagar direto ou chamar no WhatsApp, fica sem função clara ao lado das outras opções, e não menciona o WhatsApp flutuante que já existe na tela.</w:t>
       </w:r>
     </w:p>
     <w:p>
@@ -1986,7 +1986,7 @@
           <w:sz w:val="18"/>
           <w:szCs w:val="18"/>
         </w:rPr>
-        <w:t xml:space="preserve">Sugestão:</w:t>
+        <w:t xml:space="preserve">Sugestão, páginas de Sessão Estratégica:</w:t>
       </w:r>
     </w:p>
     <w:p>
@@ -2005,7 +2005,41 @@
           <w:sz w:val="20"/>
           <w:szCs w:val="20"/>
         </w:rPr>
-        <w:t xml:space="preserve">Ainda está em dúvida se a sessão é para você? Ou gostaria de tirar uma dúvida antes de adquirir? Preencha o formulário que o nosso time comercial vai te atender.</w:t>
+        <w:t xml:space="preserve">Ainda está em dúvida se a sessão é para você? Ou gostaria de tirar uma dúvida antes de adquirir? Preencha o formulário que o nosso time vai te atender, ou, se preferir, chame a gente pelo WhatsApp no botão flutuante.</w:t>
+      </w:r>
+    </w:p>
+    <w:p>
+      <w:pPr>
+        <w:spacing w:after="80"/>
+      </w:pPr>
+      <w:r>
+        <w:rPr>
+          <w:i/>
+          <w:iCs/>
+          <w:color w:val="555555"/>
+          <w:sz w:val="18"/>
+          <w:szCs w:val="18"/>
+        </w:rPr>
+        <w:t xml:space="preserve">Sugestão, páginas de Diagnóstico:</w:t>
+      </w:r>
+    </w:p>
+    <w:p>
+      <w:pPr>
+        <w:pBdr>
+          <w:left w:val="single" w:color="cccccc" w:sz="12" w:space="8"/>
+        </w:pBdr>
+        <w:spacing w:after="120"/>
+        <w:ind w:left="400"/>
+      </w:pPr>
+      <w:r>
+        <w:rPr>
+          <w:i/>
+          <w:iCs/>
+          <w:color w:val="333333"/>
+          <w:sz w:val="20"/>
+          <w:szCs w:val="20"/>
+        </w:rPr>
+        <w:t xml:space="preserve">Ainda está em dúvida se o Diagnóstico é para você? Ou gostaria de tirar uma dúvida antes de adquirir? Preencha o formulário que o nosso time vai te atender, ou, se preferir, chame a gente pelo WhatsApp no botão flutuante.</w:t>
       </w:r>
     </w:p>
     <w:p>
@@ -2026,7 +2060,7 @@
           <w:sz w:val="21"/>
           <w:szCs w:val="21"/>
         </w:rPr>
-        <w:t xml:space="preserve"> dá um motivo específico para usar o formulário (dúvida, não decisão de compra ainda), diferenciando esse caminho do botão de pagamento direto e do WhatsApp flutuante — cada opção da página passa a ter uma função clara: pagar (Hotmart), tirar dúvida rápida (WhatsApp) ou tirar dúvida mais detalhada por escrito (formulário).</w:t>
+        <w:t xml:space="preserve"> dá um motivo específico para usar o formulário (dúvida, não decisão de compra ainda), nomeia o produto certo em cada página (sessão ou Diagnóstico), e já aponta pro WhatsApp flutuante como alternativa mais rápida, sem precisar criar nada novo. Cada opção da página passa a ter uma função clara: pagar (Hotmart), tirar dúvida rápida (WhatsApp flutuante) ou tirar dúvida mais detalhada por escrito (formulário).</w:t>
       </w:r>
     </w:p>
     <w:sectPr>

</xml_diff>